<commit_message>
Actualización Diario de Reflexión Fase 1
</commit_message>
<xml_diff>
--- a/Fase 1/Evidencias Individuales/Lopez_Hernan_1.2_APT122_DiarioReflexionFase1.docx
+++ b/Fase 1/Evidencias Individuales/Lopez_Hernan_1.2_APT122_DiarioReflexionFase1.docx
@@ -1,6 +1,6 @@
 
 <file path=word/document.xml><?xml version="1.0" encoding="utf-8"?>
-<w:document xmlns:wpc="http://schemas.microsoft.com/office/word/2010/wordprocessingCanvas" xmlns:cx="http://schemas.microsoft.com/office/drawing/2014/chartex" xmlns:mc="http://schemas.openxmlformats.org/markup-compatibility/2006" xmlns:o="urn:schemas-microsoft-com:office:office" xmlns:r="http://schemas.openxmlformats.org/officeDocument/2006/relationships" xmlns:m="http://schemas.openxmlformats.org/officeDocument/2006/math" xmlns:v="urn:schemas-microsoft-com:vml" xmlns:wp14="http://schemas.microsoft.com/office/word/2010/wordprocessingDrawing" xmlns:wp="http://schemas.openxmlformats.org/drawingml/2006/wordprocessingDrawing" xmlns:w10="urn:schemas-microsoft-com:office:word" xmlns:w="http://schemas.openxmlformats.org/wordprocessingml/2006/main" xmlns:w14="http://schemas.microsoft.com/office/word/2010/wordml" xmlns:w15="http://schemas.microsoft.com/office/word/2012/wordml" xmlns:w16se="http://schemas.microsoft.com/office/word/2015/wordml/symex" xmlns:wpg="http://schemas.microsoft.com/office/word/2010/wordprocessingGroup" xmlns:wpi="http://schemas.microsoft.com/office/word/2010/wordprocessingInk" xmlns:wne="http://schemas.microsoft.com/office/word/2006/wordml" xmlns:wps="http://schemas.microsoft.com/office/word/2010/wordprocessingShape" mc:Ignorable="w14 w15 w16se wp14">
+<w:document xmlns:wpc="http://schemas.microsoft.com/office/word/2010/wordprocessingCanvas" xmlns:cx="http://schemas.microsoft.com/office/drawing/2014/chartex" xmlns:cx1="http://schemas.microsoft.com/office/drawing/2015/9/8/chartex" xmlns:cx2="http://schemas.microsoft.com/office/drawing/2015/10/21/chartex" xmlns:cx3="http://schemas.microsoft.com/office/drawing/2016/5/9/chartex" xmlns:cx4="http://schemas.microsoft.com/office/drawing/2016/5/10/chartex" xmlns:cx5="http://schemas.microsoft.com/office/drawing/2016/5/11/chartex" xmlns:cx6="http://schemas.microsoft.com/office/drawing/2016/5/12/chartex" xmlns:cx7="http://schemas.microsoft.com/office/drawing/2016/5/13/chartex" xmlns:cx8="http://schemas.microsoft.com/office/drawing/2016/5/14/chartex" xmlns:mc="http://schemas.openxmlformats.org/markup-compatibility/2006" xmlns:aink="http://schemas.microsoft.com/office/drawing/2016/ink" xmlns:am3d="http://schemas.microsoft.com/office/drawing/2017/model3d" xmlns:o="urn:schemas-microsoft-com:office:office" xmlns:oel="http://schemas.microsoft.com/office/2019/extlst" xmlns:r="http://schemas.openxmlformats.org/officeDocument/2006/relationships" xmlns:m="http://schemas.openxmlformats.org/officeDocument/2006/math" xmlns:v="urn:schemas-microsoft-com:vml" xmlns:wp14="http://schemas.microsoft.com/office/word/2010/wordprocessingDrawing" xmlns:wp="http://schemas.openxmlformats.org/drawingml/2006/wordprocessingDrawing" xmlns:w10="urn:schemas-microsoft-com:office:word" xmlns:w="http://schemas.openxmlformats.org/wordprocessingml/2006/main" xmlns:w14="http://schemas.microsoft.com/office/word/2010/wordml" xmlns:w15="http://schemas.microsoft.com/office/word/2012/wordml" xmlns:w16cex="http://schemas.microsoft.com/office/word/2018/wordml/cex" xmlns:w16cid="http://schemas.microsoft.com/office/word/2016/wordml/cid" xmlns:w16="http://schemas.microsoft.com/office/word/2018/wordml" xmlns:w16du="http://schemas.microsoft.com/office/word/2023/wordml/word16du" xmlns:w16sdtdh="http://schemas.microsoft.com/office/word/2020/wordml/sdtdatahash" xmlns:w16sdtfl="http://schemas.microsoft.com/office/word/2024/wordml/sdtformatlock" xmlns:w16se="http://schemas.microsoft.com/office/word/2015/wordml/symex" xmlns:wpg="http://schemas.microsoft.com/office/word/2010/wordprocessingGroup" xmlns:wpi="http://schemas.microsoft.com/office/word/2010/wordprocessingInk" xmlns:wne="http://schemas.microsoft.com/office/word/2006/wordml" xmlns:wps="http://schemas.microsoft.com/office/word/2010/wordprocessingShape" mc:Ignorable="w14 w15 w16se w16cid w16 w16cex w16sdtdh w16sdtfl w16du wp14">
   <w:body>
     <w:p/>
     <w:tbl>
@@ -369,6 +369,55 @@
                 <w:szCs w:val="24"/>
               </w:rPr>
             </w:pPr>
+            <w:r>
+              <w:rPr>
+                <w:rFonts w:eastAsiaTheme="majorEastAsia"/>
+                <w:color w:val="767171" w:themeColor="background2" w:themeShade="80"/>
+                <w:sz w:val="24"/>
+                <w:szCs w:val="24"/>
+              </w:rPr>
+              <w:t xml:space="preserve">De las asignaturas que he cursado, las que más disfruté y más se relacionan con mis intereses profesionales fueron Consulta de Base de Datos, Programación de Base de Datos, Big Data y Técnicas de Calidad de Software. De Consulta de Base de Datos me gustó aprender a extraer con SQL exactamente la información que se necesita mediante </w:t>
+            </w:r>
+            <w:proofErr w:type="spellStart"/>
+            <w:r>
+              <w:rPr>
+                <w:rFonts w:eastAsiaTheme="majorEastAsia"/>
+                <w:color w:val="767171" w:themeColor="background2" w:themeShade="80"/>
+                <w:sz w:val="24"/>
+                <w:szCs w:val="24"/>
+              </w:rPr>
+              <w:t>joins</w:t>
+            </w:r>
+            <w:proofErr w:type="spellEnd"/>
+            <w:r>
+              <w:rPr>
+                <w:rFonts w:eastAsiaTheme="majorEastAsia"/>
+                <w:color w:val="767171" w:themeColor="background2" w:themeShade="80"/>
+                <w:sz w:val="24"/>
+                <w:szCs w:val="24"/>
+              </w:rPr>
+              <w:t xml:space="preserve">, agrupaciones y subconsultas, y comprobar cómo una buena consulta resuelve en segundos lo que manualmente tomaría horas. Programación de Base de Datos la valoré porque llevé la base más allá de las consultas, aprendiendo a construir procedimientos, funciones y </w:t>
+            </w:r>
+            <w:proofErr w:type="spellStart"/>
+            <w:r>
+              <w:rPr>
+                <w:rFonts w:eastAsiaTheme="majorEastAsia"/>
+                <w:color w:val="767171" w:themeColor="background2" w:themeShade="80"/>
+                <w:sz w:val="24"/>
+                <w:szCs w:val="24"/>
+              </w:rPr>
+              <w:t>triggers</w:t>
+            </w:r>
+            <w:proofErr w:type="spellEnd"/>
+            <w:r>
+              <w:rPr>
+                <w:rFonts w:eastAsiaTheme="majorEastAsia"/>
+                <w:color w:val="767171" w:themeColor="background2" w:themeShade="80"/>
+                <w:sz w:val="24"/>
+                <w:szCs w:val="24"/>
+              </w:rPr>
+              <w:t xml:space="preserve"> para automatizar reglas de negocio dentro del propio motor. Big Data fue la que más conectó con mis intereses, al enfrentarme al desafío de procesar grandes volúmenes de datos y transformarlos en información útil para la toma de decisiones. Y de Técnicas de Calidad de Software rescato haber cambiado mi mirada del desarrollo: aprendí a diseñar y aplicar pruebas de forma sistemática para asegurar que el software no solo funcione, sino que siga funcionando bien tras cada cambio. En conjunto, estas asignaturas reforzaron mi interés por el trabajo con datos y por el aseguramiento de la calidad.</w:t>
+            </w:r>
           </w:p>
           <w:p>
             <w:pPr>
@@ -451,90 +500,25 @@
                 <w:szCs w:val="24"/>
               </w:rPr>
             </w:pPr>
-          </w:p>
-          <w:p>
-            <w:pPr>
+            <w:r>
               <w:rPr>
                 <w:rFonts w:eastAsiaTheme="majorEastAsia"/>
                 <w:color w:val="767171" w:themeColor="background2" w:themeShade="80"/>
                 <w:sz w:val="24"/>
                 <w:szCs w:val="24"/>
               </w:rPr>
-            </w:pPr>
-          </w:p>
-          <w:p>
-            <w:pPr>
+              <w:t xml:space="preserve">Sí, existe un valor real en las certificaciones que se obtienen a lo largo de la carrera. Cada certificado agrupa un conjunto completo de asignaturas y competencias relacionadas, por lo que no acredita solo un ramo aislado, sino el dominio de un área completa de desempeño. Son certificaciones habilitantes, es decir, respaldan que puedo cumplir una función laboral concreta, lo que incrementa mi empleabilidad y le muestra a un empleador, de forma clara y reconocida, en qué áreas tengo </w:t>
+            </w:r>
+            <w:r>
               <w:rPr>
                 <w:rFonts w:eastAsiaTheme="majorEastAsia"/>
                 <w:color w:val="767171" w:themeColor="background2" w:themeShade="80"/>
                 <w:sz w:val="24"/>
                 <w:szCs w:val="24"/>
               </w:rPr>
-            </w:pPr>
-          </w:p>
-          <w:p>
-            <w:pPr>
-              <w:rPr>
-                <w:rFonts w:eastAsiaTheme="majorEastAsia"/>
-                <w:color w:val="767171" w:themeColor="background2" w:themeShade="80"/>
-                <w:sz w:val="24"/>
-                <w:szCs w:val="24"/>
-              </w:rPr>
-            </w:pPr>
-          </w:p>
-          <w:p>
-            <w:pPr>
-              <w:rPr>
-                <w:rFonts w:eastAsiaTheme="majorEastAsia"/>
-                <w:color w:val="767171" w:themeColor="background2" w:themeShade="80"/>
-                <w:sz w:val="24"/>
-                <w:szCs w:val="24"/>
-              </w:rPr>
-            </w:pPr>
-          </w:p>
-          <w:p>
-            <w:pPr>
-              <w:jc w:val="both"/>
-              <w:rPr>
-                <w:rFonts w:ascii="Calibri" w:hAnsi="Calibri"/>
-                <w:b/>
-                <w:bCs/>
-                <w:color w:val="1F4E79" w:themeColor="accent1" w:themeShade="80"/>
-              </w:rPr>
-            </w:pPr>
-          </w:p>
-          <w:p>
-            <w:pPr>
-              <w:jc w:val="both"/>
-              <w:rPr>
-                <w:rFonts w:ascii="Calibri" w:hAnsi="Calibri"/>
-                <w:b/>
-                <w:bCs/>
-                <w:color w:val="1F4E79" w:themeColor="accent1" w:themeShade="80"/>
-              </w:rPr>
-            </w:pPr>
-          </w:p>
-          <w:p>
-            <w:pPr>
-              <w:jc w:val="both"/>
-              <w:rPr>
-                <w:rFonts w:ascii="Calibri" w:hAnsi="Calibri"/>
-                <w:b/>
-                <w:bCs/>
-                <w:color w:val="1F4E79" w:themeColor="accent1" w:themeShade="80"/>
-              </w:rPr>
-            </w:pPr>
-          </w:p>
-          <w:p>
-            <w:pPr>
-              <w:jc w:val="both"/>
-              <w:rPr>
-                <w:rFonts w:ascii="Calibri" w:hAnsi="Calibri"/>
-                <w:b/>
-                <w:bCs/>
-                <w:color w:val="1F4E79" w:themeColor="accent1" w:themeShade="80"/>
-              </w:rPr>
-            </w:pPr>
+              <w:lastRenderedPageBreak/>
+              <w:t>formación sólida. En mi caso, los certificados en Análisis y Desarrollo de Modelos de Datos y en Inteligencia de Negocios tienen especial valor porque respaldan directamente mi perfil orientado al trabajo con datos y analítica, mientras que el de Calidad de Software refuerza mi capacidad en aseguramiento de la calidad. En conjunto, estas certificaciones me permiten proyectar mi especialidad de manera concreta y diferenciarme en el mercado laboral, más allá de la sola aprobación de las asignaturas.</w:t>
+            </w:r>
           </w:p>
         </w:tc>
       </w:tr>
@@ -641,7 +625,6 @@
                 <w:sz w:val="24"/>
                 <w:szCs w:val="24"/>
               </w:rPr>
-              <w:lastRenderedPageBreak/>
               <w:t xml:space="preserve">2. Revisa las competencias y unidades de competencias correspondientes a cada asignatura de la malla de tu carrera. Marca en </w:t>
             </w:r>
             <w:r>
@@ -798,6 +781,15 @@
                 <w:szCs w:val="24"/>
               </w:rPr>
             </w:pPr>
+            <w:r>
+              <w:rPr>
+                <w:rFonts w:eastAsiaTheme="majorEastAsia"/>
+                <w:color w:val="767171" w:themeColor="background2" w:themeShade="80"/>
+                <w:sz w:val="24"/>
+                <w:szCs w:val="24"/>
+              </w:rPr>
+              <w:t>Mis principales fortalezas se concentran en el ámbito de la gestión de datos y el aseguramiento de la calidad del software. Entre las competencias que aplico con mayor seguridad se encuentran la construcción de modelos de datos, la programación de consultas para la manipulación de bases de datos y la transformación de grandes volúmenes de datos para la toma de decisiones, asociadas a los certificados en Análisis y Desarrollo de Modelos de Datos e Inteligencia de Negocios. A ello se suman las competencias de realización de pruebas y aseguramiento de la calidad, correspondientes al certificado en Calidad de Software.</w:t>
+            </w:r>
           </w:p>
           <w:p>
             <w:pPr>
@@ -826,173 +818,53 @@
                 <w:szCs w:val="24"/>
               </w:rPr>
             </w:pPr>
-          </w:p>
-          <w:p>
-            <w:pPr>
-              <w:tabs>
-                <w:tab w:val="left" w:pos="454"/>
-              </w:tabs>
-              <w:jc w:val="both"/>
+            <w:r>
               <w:rPr>
                 <w:rFonts w:eastAsiaTheme="majorEastAsia"/>
                 <w:color w:val="767171" w:themeColor="background2" w:themeShade="80"/>
                 <w:sz w:val="24"/>
                 <w:szCs w:val="24"/>
               </w:rPr>
-            </w:pPr>
-          </w:p>
-          <w:p>
-            <w:pPr>
-              <w:tabs>
-                <w:tab w:val="left" w:pos="454"/>
-              </w:tabs>
-              <w:jc w:val="both"/>
+              <w:t xml:space="preserve">Como competencias a fortalecer identifico las relacionadas con la seguridad y la resolución de vulnerabilidades de los sistemas computacionales, correspondientes al certificado en Arquitectura de Software, ámbito en el que reconozco un menor nivel de dominio. Asimismo, </w:t>
+            </w:r>
+            <w:proofErr w:type="spellStart"/>
+            <w:r>
               <w:rPr>
                 <w:rFonts w:eastAsiaTheme="majorEastAsia"/>
                 <w:color w:val="767171" w:themeColor="background2" w:themeShade="80"/>
                 <w:sz w:val="24"/>
                 <w:szCs w:val="24"/>
               </w:rPr>
-            </w:pPr>
-          </w:p>
-          <w:p>
-            <w:pPr>
-              <w:tabs>
-                <w:tab w:val="left" w:pos="454"/>
-              </w:tabs>
-              <w:jc w:val="both"/>
+              <w:t>considero</w:t>
+            </w:r>
+            <w:proofErr w:type="spellEnd"/>
+            <w:r>
               <w:rPr>
                 <w:rFonts w:eastAsiaTheme="majorEastAsia"/>
                 <w:color w:val="767171" w:themeColor="background2" w:themeShade="80"/>
                 <w:sz w:val="24"/>
                 <w:szCs w:val="24"/>
               </w:rPr>
-            </w:pPr>
-          </w:p>
-          <w:p>
-            <w:pPr>
-              <w:tabs>
-                <w:tab w:val="left" w:pos="454"/>
-              </w:tabs>
-              <w:jc w:val="both"/>
+              <w:t xml:space="preserve"> necesario reforzar la construcción de modelos arquitectónicos de soluciones sistémicas completas, ya que comprendo sus </w:t>
+            </w:r>
+            <w:r>
               <w:rPr>
                 <w:rFonts w:eastAsiaTheme="majorEastAsia"/>
                 <w:color w:val="767171" w:themeColor="background2" w:themeShade="80"/>
                 <w:sz w:val="24"/>
                 <w:szCs w:val="24"/>
               </w:rPr>
-            </w:pPr>
-          </w:p>
-          <w:p>
-            <w:pPr>
-              <w:tabs>
-                <w:tab w:val="left" w:pos="454"/>
-              </w:tabs>
-              <w:jc w:val="both"/>
+              <w:t>fundamentos,</w:t>
+            </w:r>
+            <w:r>
               <w:rPr>
                 <w:rFonts w:eastAsiaTheme="majorEastAsia"/>
                 <w:color w:val="767171" w:themeColor="background2" w:themeShade="80"/>
                 <w:sz w:val="24"/>
                 <w:szCs w:val="24"/>
               </w:rPr>
-            </w:pPr>
-          </w:p>
-          <w:p>
-            <w:pPr>
-              <w:tabs>
-                <w:tab w:val="left" w:pos="454"/>
-              </w:tabs>
-              <w:ind w:left="171"/>
-              <w:jc w:val="both"/>
-              <w:rPr>
-                <w:rFonts w:eastAsiaTheme="majorEastAsia"/>
-                <w:color w:val="767171" w:themeColor="background2" w:themeShade="80"/>
-                <w:sz w:val="24"/>
-                <w:szCs w:val="24"/>
-              </w:rPr>
-            </w:pPr>
-          </w:p>
-          <w:p>
-            <w:pPr>
-              <w:jc w:val="both"/>
-              <w:rPr>
-                <w:rFonts w:eastAsiaTheme="majorEastAsia"/>
-                <w:color w:val="767171" w:themeColor="background2" w:themeShade="80"/>
-                <w:sz w:val="24"/>
-                <w:szCs w:val="24"/>
-              </w:rPr>
-            </w:pPr>
-          </w:p>
-          <w:p>
-            <w:pPr>
-              <w:jc w:val="both"/>
-              <w:rPr>
-                <w:rFonts w:ascii="Calibri" w:hAnsi="Calibri"/>
-                <w:b/>
-                <w:bCs/>
-              </w:rPr>
-            </w:pPr>
-          </w:p>
-          <w:p>
-            <w:pPr>
-              <w:jc w:val="both"/>
-              <w:rPr>
-                <w:rFonts w:ascii="Calibri" w:hAnsi="Calibri"/>
-                <w:b/>
-                <w:bCs/>
-              </w:rPr>
-            </w:pPr>
-          </w:p>
-          <w:p>
-            <w:pPr>
-              <w:jc w:val="both"/>
-              <w:rPr>
-                <w:rFonts w:ascii="Calibri" w:hAnsi="Calibri"/>
-                <w:b/>
-                <w:bCs/>
-              </w:rPr>
-            </w:pPr>
-          </w:p>
-          <w:p>
-            <w:pPr>
-              <w:jc w:val="both"/>
-              <w:rPr>
-                <w:rFonts w:ascii="Calibri" w:hAnsi="Calibri"/>
-                <w:b/>
-                <w:bCs/>
-              </w:rPr>
-            </w:pPr>
-          </w:p>
-          <w:p>
-            <w:pPr>
-              <w:jc w:val="both"/>
-              <w:rPr>
-                <w:rFonts w:ascii="Calibri" w:hAnsi="Calibri"/>
-                <w:b/>
-                <w:bCs/>
-              </w:rPr>
-            </w:pPr>
-          </w:p>
-          <w:p>
-            <w:pPr>
-              <w:jc w:val="both"/>
-              <w:rPr>
-                <w:rFonts w:ascii="Calibri" w:hAnsi="Calibri"/>
-                <w:b/>
-                <w:bCs/>
-              </w:rPr>
-            </w:pPr>
-          </w:p>
-          <w:p>
-            <w:pPr>
-              <w:jc w:val="both"/>
-              <w:rPr>
-                <w:rFonts w:ascii="Calibri" w:hAnsi="Calibri"/>
-                <w:b/>
-                <w:bCs/>
-                <w:color w:val="1F4E79" w:themeColor="accent1" w:themeShade="80"/>
-              </w:rPr>
-            </w:pPr>
+              <w:t xml:space="preserve"> pero requiero mayor experiencia en el diseño de soluciones de punta a punta. Este reconocimiento constituye un insumo relevante para orientar mi Proyecto APT hacia mis fortalezas en el área de datos, incorporando la seguridad como un aspecto por desarrollar.</w:t>
+            </w:r>
           </w:p>
         </w:tc>
       </w:tr>
@@ -1012,90 +884,6 @@
     <w:p/>
     <w:p/>
     <w:p/>
-    <w:p>
-      <w:pPr>
-        <w:spacing w:after="0" w:line="360" w:lineRule="auto"/>
-        <w:jc w:val="both"/>
-        <w:rPr>
-          <w:b/>
-          <w:bCs/>
-          <w:sz w:val="24"/>
-          <w:szCs w:val="24"/>
-        </w:rPr>
-      </w:pPr>
-    </w:p>
-    <w:p>
-      <w:pPr>
-        <w:spacing w:after="0" w:line="360" w:lineRule="auto"/>
-        <w:jc w:val="both"/>
-        <w:rPr>
-          <w:b/>
-          <w:bCs/>
-          <w:sz w:val="24"/>
-          <w:szCs w:val="24"/>
-        </w:rPr>
-      </w:pPr>
-    </w:p>
-    <w:p>
-      <w:pPr>
-        <w:spacing w:after="0" w:line="360" w:lineRule="auto"/>
-        <w:jc w:val="both"/>
-        <w:rPr>
-          <w:b/>
-          <w:bCs/>
-          <w:sz w:val="24"/>
-          <w:szCs w:val="24"/>
-        </w:rPr>
-      </w:pPr>
-    </w:p>
-    <w:p>
-      <w:pPr>
-        <w:spacing w:after="0" w:line="360" w:lineRule="auto"/>
-        <w:jc w:val="both"/>
-        <w:rPr>
-          <w:b/>
-          <w:bCs/>
-          <w:sz w:val="24"/>
-          <w:szCs w:val="24"/>
-        </w:rPr>
-      </w:pPr>
-    </w:p>
-    <w:p>
-      <w:pPr>
-        <w:spacing w:after="0" w:line="360" w:lineRule="auto"/>
-        <w:jc w:val="both"/>
-        <w:rPr>
-          <w:b/>
-          <w:bCs/>
-          <w:sz w:val="24"/>
-          <w:szCs w:val="24"/>
-        </w:rPr>
-      </w:pPr>
-    </w:p>
-    <w:p>
-      <w:pPr>
-        <w:spacing w:after="0" w:line="360" w:lineRule="auto"/>
-        <w:jc w:val="both"/>
-        <w:rPr>
-          <w:b/>
-          <w:bCs/>
-          <w:sz w:val="24"/>
-          <w:szCs w:val="24"/>
-        </w:rPr>
-      </w:pPr>
-    </w:p>
-    <w:p>
-      <w:pPr>
-        <w:spacing w:after="0" w:line="360" w:lineRule="auto"/>
-        <w:jc w:val="both"/>
-        <w:rPr>
-          <w:b/>
-          <w:bCs/>
-          <w:sz w:val="24"/>
-          <w:szCs w:val="24"/>
-        </w:rPr>
-      </w:pPr>
-    </w:p>
     <w:p>
       <w:pPr>
         <w:spacing w:after="0" w:line="360" w:lineRule="auto"/>
@@ -1162,6 +950,7 @@
                 <w:sz w:val="24"/>
                 <w:szCs w:val="24"/>
               </w:rPr>
+              <w:lastRenderedPageBreak/>
               <w:t>3. A partir de las respuestas anteriores y el perfil de egreso de tu carrera (competencias), responde las siguientes preguntas:</w:t>
             </w:r>
           </w:p>
@@ -1242,62 +1031,15 @@
                 <w:szCs w:val="24"/>
               </w:rPr>
             </w:pPr>
-          </w:p>
-          <w:p>
-            <w:pPr>
-              <w:tabs>
-                <w:tab w:val="left" w:pos="454"/>
-              </w:tabs>
-              <w:jc w:val="both"/>
+            <w:r>
               <w:rPr>
                 <w:rFonts w:eastAsiaTheme="majorEastAsia"/>
                 <w:color w:val="767171" w:themeColor="background2" w:themeShade="80"/>
                 <w:sz w:val="24"/>
                 <w:szCs w:val="24"/>
               </w:rPr>
-            </w:pPr>
-          </w:p>
-          <w:p>
-            <w:pPr>
-              <w:tabs>
-                <w:tab w:val="left" w:pos="454"/>
-              </w:tabs>
-              <w:jc w:val="both"/>
-              <w:rPr>
-                <w:rFonts w:eastAsiaTheme="majorEastAsia"/>
-                <w:color w:val="767171" w:themeColor="background2" w:themeShade="80"/>
-                <w:sz w:val="24"/>
-                <w:szCs w:val="24"/>
-              </w:rPr>
-            </w:pPr>
-          </w:p>
-          <w:p>
-            <w:pPr>
-              <w:tabs>
-                <w:tab w:val="left" w:pos="454"/>
-              </w:tabs>
-              <w:jc w:val="both"/>
-              <w:rPr>
-                <w:rFonts w:eastAsiaTheme="majorEastAsia"/>
-                <w:color w:val="767171" w:themeColor="background2" w:themeShade="80"/>
-                <w:sz w:val="24"/>
-                <w:szCs w:val="24"/>
-              </w:rPr>
-            </w:pPr>
-          </w:p>
-          <w:p>
-            <w:pPr>
-              <w:tabs>
-                <w:tab w:val="left" w:pos="454"/>
-              </w:tabs>
-              <w:jc w:val="both"/>
-              <w:rPr>
-                <w:rFonts w:eastAsiaTheme="majorEastAsia"/>
-                <w:color w:val="767171" w:themeColor="background2" w:themeShade="80"/>
-                <w:sz w:val="24"/>
-                <w:szCs w:val="24"/>
-              </w:rPr>
-            </w:pPr>
+              <w:t>Mis principales intereses profesionales se orientan al ámbito de los datos, específicamente al análisis de datos, la inteligencia de negocios y el procesamiento de grandes volúmenes de información. Dentro de este campo, el área que más me interesa es el diseño y desarrollo de soluciones de datos apoyadas en tecnologías cloud, dado que combina el trabajo técnico con bases de datos y el aporte directo a la toma de decisiones de una organización.</w:t>
+            </w:r>
           </w:p>
           <w:p>
             <w:pPr>
@@ -1368,76 +1110,15 @@
                 <w:szCs w:val="24"/>
               </w:rPr>
             </w:pPr>
-          </w:p>
-          <w:p>
-            <w:pPr>
-              <w:tabs>
-                <w:tab w:val="left" w:pos="454"/>
-              </w:tabs>
-              <w:jc w:val="both"/>
+            <w:r>
               <w:rPr>
                 <w:rFonts w:eastAsiaTheme="majorEastAsia"/>
                 <w:color w:val="767171" w:themeColor="background2" w:themeShade="80"/>
                 <w:sz w:val="24"/>
                 <w:szCs w:val="24"/>
               </w:rPr>
-            </w:pPr>
-          </w:p>
-          <w:p>
-            <w:pPr>
-              <w:tabs>
-                <w:tab w:val="left" w:pos="454"/>
-              </w:tabs>
-              <w:jc w:val="both"/>
-              <w:rPr>
-                <w:rFonts w:eastAsiaTheme="majorEastAsia"/>
-                <w:color w:val="767171" w:themeColor="background2" w:themeShade="80"/>
-                <w:sz w:val="24"/>
-                <w:szCs w:val="24"/>
-              </w:rPr>
-            </w:pPr>
-          </w:p>
-          <w:p>
-            <w:pPr>
-              <w:tabs>
-                <w:tab w:val="left" w:pos="454"/>
-              </w:tabs>
-              <w:jc w:val="both"/>
-              <w:rPr>
-                <w:rFonts w:eastAsiaTheme="majorEastAsia"/>
-                <w:color w:val="767171" w:themeColor="background2" w:themeShade="80"/>
-                <w:sz w:val="24"/>
-                <w:szCs w:val="24"/>
-              </w:rPr>
-            </w:pPr>
-          </w:p>
-          <w:p>
-            <w:pPr>
-              <w:tabs>
-                <w:tab w:val="left" w:pos="454"/>
-              </w:tabs>
-              <w:jc w:val="both"/>
-              <w:rPr>
-                <w:rFonts w:eastAsiaTheme="majorEastAsia"/>
-                <w:color w:val="767171" w:themeColor="background2" w:themeShade="80"/>
-                <w:sz w:val="24"/>
-                <w:szCs w:val="24"/>
-              </w:rPr>
-            </w:pPr>
-          </w:p>
-          <w:p>
-            <w:pPr>
-              <w:tabs>
-                <w:tab w:val="left" w:pos="454"/>
-              </w:tabs>
-              <w:jc w:val="both"/>
-              <w:rPr>
-                <w:rFonts w:eastAsiaTheme="majorEastAsia"/>
-                <w:color w:val="767171" w:themeColor="background2" w:themeShade="80"/>
-                <w:sz w:val="24"/>
-                <w:szCs w:val="24"/>
-              </w:rPr>
-            </w:pPr>
+              <w:t>Las competencias que se relacionan más estrechamente con estos intereses son la construcción de modelos de datos, la programación de consultas para la manipulación de bases de datos y la transformación de grandes volúmenes de datos para la obtención de información y conocimiento. Junto a ellas, considero relevante el aseguramiento de la calidad del software como competencia transversal. De estas, la que siento que requiero fortalecer especialmente es la relacionada con la seguridad de los sistemas, de modo que las soluciones de datos que desarrolle sean también robustas y confiables.</w:t>
+            </w:r>
           </w:p>
           <w:p>
             <w:pPr>
@@ -1522,116 +1203,15 @@
                 <w:szCs w:val="24"/>
               </w:rPr>
             </w:pPr>
-          </w:p>
-          <w:p>
-            <w:pPr>
-              <w:jc w:val="both"/>
-              <w:rPr>
-                <w:rFonts w:ascii="Calibri" w:hAnsi="Calibri"/>
-                <w:b/>
-                <w:bCs/>
-                <w:color w:val="1F4E79" w:themeColor="accent1" w:themeShade="80"/>
-              </w:rPr>
-            </w:pPr>
-          </w:p>
-          <w:p>
-            <w:pPr>
-              <w:jc w:val="both"/>
-              <w:rPr>
-                <w:rFonts w:ascii="Calibri" w:hAnsi="Calibri"/>
-                <w:b/>
-                <w:bCs/>
-                <w:color w:val="1F4E79" w:themeColor="accent1" w:themeShade="80"/>
-              </w:rPr>
-            </w:pPr>
-          </w:p>
-          <w:p>
-            <w:pPr>
-              <w:jc w:val="both"/>
-              <w:rPr>
-                <w:rFonts w:ascii="Calibri" w:hAnsi="Calibri"/>
-                <w:b/>
-                <w:bCs/>
-                <w:color w:val="1F4E79" w:themeColor="accent1" w:themeShade="80"/>
-              </w:rPr>
-            </w:pPr>
-          </w:p>
-          <w:p>
-            <w:pPr>
-              <w:jc w:val="both"/>
-              <w:rPr>
-                <w:rFonts w:ascii="Calibri" w:hAnsi="Calibri"/>
-                <w:b/>
-                <w:bCs/>
-                <w:color w:val="1F4E79" w:themeColor="accent1" w:themeShade="80"/>
-              </w:rPr>
-            </w:pPr>
-          </w:p>
-          <w:p>
-            <w:pPr>
-              <w:jc w:val="both"/>
-              <w:rPr>
-                <w:rFonts w:ascii="Calibri" w:hAnsi="Calibri"/>
-                <w:b/>
-                <w:bCs/>
-                <w:color w:val="1F4E79" w:themeColor="accent1" w:themeShade="80"/>
-              </w:rPr>
-            </w:pPr>
-          </w:p>
-          <w:p>
-            <w:pPr>
-              <w:jc w:val="both"/>
-              <w:rPr>
-                <w:rFonts w:ascii="Calibri" w:hAnsi="Calibri"/>
-                <w:b/>
-                <w:bCs/>
-                <w:color w:val="1F4E79" w:themeColor="accent1" w:themeShade="80"/>
-              </w:rPr>
-            </w:pPr>
-          </w:p>
-          <w:p>
-            <w:pPr>
-              <w:jc w:val="both"/>
-              <w:rPr>
-                <w:rFonts w:ascii="Calibri" w:hAnsi="Calibri"/>
-                <w:b/>
-                <w:bCs/>
-                <w:color w:val="1F4E79" w:themeColor="accent1" w:themeShade="80"/>
-              </w:rPr>
-            </w:pPr>
-          </w:p>
-          <w:p>
-            <w:pPr>
-              <w:jc w:val="both"/>
-              <w:rPr>
-                <w:rFonts w:ascii="Calibri" w:hAnsi="Calibri"/>
-                <w:b/>
-                <w:bCs/>
-                <w:color w:val="1F4E79" w:themeColor="accent1" w:themeShade="80"/>
-              </w:rPr>
-            </w:pPr>
-          </w:p>
-          <w:p>
-            <w:pPr>
-              <w:jc w:val="both"/>
-              <w:rPr>
-                <w:rFonts w:ascii="Calibri" w:hAnsi="Calibri"/>
-                <w:b/>
-                <w:bCs/>
-                <w:color w:val="1F4E79" w:themeColor="accent1" w:themeShade="80"/>
-              </w:rPr>
-            </w:pPr>
-          </w:p>
-          <w:p>
-            <w:pPr>
-              <w:jc w:val="both"/>
-              <w:rPr>
-                <w:rFonts w:ascii="Calibri" w:hAnsi="Calibri"/>
-                <w:b/>
-                <w:bCs/>
-                <w:color w:val="1F4E79" w:themeColor="accent1" w:themeShade="80"/>
-              </w:rPr>
-            </w:pPr>
+            <w:r>
+              <w:rPr>
+                <w:rFonts w:eastAsiaTheme="majorEastAsia"/>
+                <w:color w:val="767171" w:themeColor="background2" w:themeShade="80"/>
+                <w:sz w:val="24"/>
+                <w:szCs w:val="24"/>
+              </w:rPr>
+              <w:t>En un horizonte de cinco años me gustaría desempeñarme como profesional especializado en el área de datos, en roles vinculados a la ingeniería de datos, el análisis de datos o la inteligencia de negocios. Aspiro a estar diseñando e implementando soluciones que permitan transformar datos en información útil para la toma de decisiones, asumiendo progresivamente mayores responsabilidades técnicas dentro de un equipo, y manteniéndome actualizado en tecnologías de datos y en la nube.</w:t>
+            </w:r>
           </w:p>
         </w:tc>
       </w:tr>
@@ -1645,6 +1225,42 @@
           <w:sz w:val="24"/>
           <w:szCs w:val="24"/>
           <w:lang w:eastAsia="ja-JP"/>
+        </w:rPr>
+      </w:pPr>
+    </w:p>
+    <w:p>
+      <w:pPr>
+        <w:spacing w:after="0" w:line="360" w:lineRule="auto"/>
+        <w:jc w:val="both"/>
+        <w:rPr>
+          <w:b/>
+          <w:bCs/>
+          <w:sz w:val="24"/>
+          <w:szCs w:val="24"/>
+        </w:rPr>
+      </w:pPr>
+    </w:p>
+    <w:p>
+      <w:pPr>
+        <w:spacing w:after="0" w:line="360" w:lineRule="auto"/>
+        <w:jc w:val="both"/>
+        <w:rPr>
+          <w:b/>
+          <w:bCs/>
+          <w:sz w:val="24"/>
+          <w:szCs w:val="24"/>
+        </w:rPr>
+      </w:pPr>
+    </w:p>
+    <w:p>
+      <w:pPr>
+        <w:spacing w:after="0" w:line="360" w:lineRule="auto"/>
+        <w:jc w:val="both"/>
+        <w:rPr>
+          <w:b/>
+          <w:bCs/>
+          <w:sz w:val="24"/>
+          <w:szCs w:val="24"/>
         </w:rPr>
       </w:pPr>
     </w:p>
@@ -1743,14 +1359,13 @@
                 <w:szCs w:val="20"/>
               </w:rPr>
             </w:pPr>
-            <w:bookmarkStart w:id="0" w:name="_GoBack"/>
-            <w:bookmarkEnd w:id="0"/>
             <w:r>
               <w:rPr>
                 <w:rFonts w:eastAsiaTheme="majorEastAsia"/>
                 <w:sz w:val="24"/>
                 <w:szCs w:val="24"/>
               </w:rPr>
+              <w:lastRenderedPageBreak/>
               <w:t xml:space="preserve">4. Finalmente, piensa en el proyecto que desarrollarás en APT y responde a las siguientes preguntas: </w:t>
             </w:r>
           </w:p>
@@ -1831,6 +1446,75 @@
                 <w:szCs w:val="24"/>
               </w:rPr>
             </w:pPr>
+            <w:r>
+              <w:rPr>
+                <w:rFonts w:eastAsiaTheme="majorEastAsia"/>
+                <w:color w:val="767171" w:themeColor="background2" w:themeShade="80"/>
+                <w:sz w:val="24"/>
+                <w:szCs w:val="24"/>
+              </w:rPr>
+              <w:t xml:space="preserve">Los proyectos que había diseñado previamente se relacionan con mis proyecciones profesionales, en tanto apuntan al desarrollo de soluciones tecnológicas orientadas al manejo de información. En esta fase opté por tomar un proyecto propuesto por la empresa </w:t>
+            </w:r>
+            <w:proofErr w:type="spellStart"/>
+            <w:r>
+              <w:rPr>
+                <w:rFonts w:eastAsiaTheme="majorEastAsia"/>
+                <w:color w:val="767171" w:themeColor="background2" w:themeShade="80"/>
+                <w:sz w:val="24"/>
+                <w:szCs w:val="24"/>
+              </w:rPr>
+              <w:t>Alloxentric</w:t>
+            </w:r>
+            <w:proofErr w:type="spellEnd"/>
+            <w:r>
+              <w:rPr>
+                <w:rFonts w:eastAsiaTheme="majorEastAsia"/>
+                <w:color w:val="767171" w:themeColor="background2" w:themeShade="80"/>
+                <w:sz w:val="24"/>
+                <w:szCs w:val="24"/>
+              </w:rPr>
+              <w:t xml:space="preserve">, correspondiente al ND Sales </w:t>
+            </w:r>
+            <w:proofErr w:type="spellStart"/>
+            <w:r>
+              <w:rPr>
+                <w:rFonts w:eastAsiaTheme="majorEastAsia"/>
+                <w:color w:val="767171" w:themeColor="background2" w:themeShade="80"/>
+                <w:sz w:val="24"/>
+                <w:szCs w:val="24"/>
+              </w:rPr>
+              <w:t>Assistant</w:t>
+            </w:r>
+            <w:proofErr w:type="spellEnd"/>
+            <w:r>
+              <w:rPr>
+                <w:rFonts w:eastAsiaTheme="majorEastAsia"/>
+                <w:color w:val="767171" w:themeColor="background2" w:themeShade="80"/>
+                <w:sz w:val="24"/>
+                <w:szCs w:val="24"/>
+              </w:rPr>
+              <w:t xml:space="preserve">, una plataforma SaaS de marketing con inteligencia artificial desarrollada para el cliente </w:t>
+            </w:r>
+            <w:proofErr w:type="spellStart"/>
+            <w:r>
+              <w:rPr>
+                <w:rFonts w:eastAsiaTheme="majorEastAsia"/>
+                <w:color w:val="767171" w:themeColor="background2" w:themeShade="80"/>
+                <w:sz w:val="24"/>
+                <w:szCs w:val="24"/>
+              </w:rPr>
+              <w:t>NoonDalton</w:t>
+            </w:r>
+            <w:proofErr w:type="spellEnd"/>
+            <w:r>
+              <w:rPr>
+                <w:rFonts w:eastAsiaTheme="majorEastAsia"/>
+                <w:color w:val="767171" w:themeColor="background2" w:themeShade="80"/>
+                <w:sz w:val="24"/>
+                <w:szCs w:val="24"/>
+              </w:rPr>
+              <w:t>, que genera contenido y propuestas comerciales. Este proyecto es el que más se relaciona con mis intereses actuales, ya que integra el trabajo con datos, el uso de modelos de lenguaje mediante técnicas de recuperación aumentada (RAG) y el aseguramiento de la calidad del software, áreas en las que reconozco mis principales fortalezas. Por tratarse de un proyecto de continuidad ya en producción, más que ajustes de fondo requiere alinear el alcance de las mejoras a las capacidades del equipo y al plazo disponible.</w:t>
+            </w:r>
           </w:p>
           <w:p>
             <w:pPr>
@@ -1841,72 +1525,6 @@
               <w:rPr>
                 <w:rFonts w:eastAsiaTheme="majorEastAsia"/>
                 <w:color w:val="767171" w:themeColor="background2" w:themeShade="80"/>
-                <w:sz w:val="24"/>
-                <w:szCs w:val="24"/>
-              </w:rPr>
-            </w:pPr>
-          </w:p>
-          <w:p>
-            <w:pPr>
-              <w:tabs>
-                <w:tab w:val="left" w:pos="454"/>
-              </w:tabs>
-              <w:jc w:val="both"/>
-              <w:rPr>
-                <w:rFonts w:eastAsiaTheme="majorEastAsia"/>
-                <w:color w:val="767171" w:themeColor="background2" w:themeShade="80"/>
-                <w:sz w:val="24"/>
-                <w:szCs w:val="24"/>
-              </w:rPr>
-            </w:pPr>
-          </w:p>
-          <w:p>
-            <w:pPr>
-              <w:tabs>
-                <w:tab w:val="left" w:pos="454"/>
-              </w:tabs>
-              <w:jc w:val="both"/>
-              <w:rPr>
-                <w:rFonts w:eastAsiaTheme="majorEastAsia"/>
-                <w:sz w:val="24"/>
-                <w:szCs w:val="24"/>
-              </w:rPr>
-            </w:pPr>
-          </w:p>
-          <w:p>
-            <w:pPr>
-              <w:tabs>
-                <w:tab w:val="left" w:pos="454"/>
-              </w:tabs>
-              <w:jc w:val="both"/>
-              <w:rPr>
-                <w:rFonts w:eastAsiaTheme="majorEastAsia"/>
-                <w:sz w:val="24"/>
-                <w:szCs w:val="24"/>
-              </w:rPr>
-            </w:pPr>
-          </w:p>
-          <w:p>
-            <w:pPr>
-              <w:tabs>
-                <w:tab w:val="left" w:pos="454"/>
-              </w:tabs>
-              <w:jc w:val="both"/>
-              <w:rPr>
-                <w:rFonts w:eastAsiaTheme="majorEastAsia"/>
-                <w:sz w:val="24"/>
-                <w:szCs w:val="24"/>
-              </w:rPr>
-            </w:pPr>
-          </w:p>
-          <w:p>
-            <w:pPr>
-              <w:tabs>
-                <w:tab w:val="left" w:pos="454"/>
-              </w:tabs>
-              <w:jc w:val="both"/>
-              <w:rPr>
-                <w:rFonts w:eastAsiaTheme="majorEastAsia"/>
                 <w:sz w:val="24"/>
                 <w:szCs w:val="24"/>
               </w:rPr>
@@ -2213,7 +1831,7 @@
 </file>
 
 <file path=word/endnotes.xml><?xml version="1.0" encoding="utf-8"?>
-<w:endnotes xmlns:wpc="http://schemas.microsoft.com/office/word/2010/wordprocessingCanvas" xmlns:cx="http://schemas.microsoft.com/office/drawing/2014/chartex" xmlns:mc="http://schemas.openxmlformats.org/markup-compatibility/2006" xmlns:o="urn:schemas-microsoft-com:office:office" xmlns:r="http://schemas.openxmlformats.org/officeDocument/2006/relationships" xmlns:m="http://schemas.openxmlformats.org/officeDocument/2006/math" xmlns:v="urn:schemas-microsoft-com:vml" xmlns:wp14="http://schemas.microsoft.com/office/word/2010/wordprocessingDrawing" xmlns:wp="http://schemas.openxmlformats.org/drawingml/2006/wordprocessingDrawing" xmlns:w10="urn:schemas-microsoft-com:office:word" xmlns:w="http://schemas.openxmlformats.org/wordprocessingml/2006/main" xmlns:w14="http://schemas.microsoft.com/office/word/2010/wordml" xmlns:w15="http://schemas.microsoft.com/office/word/2012/wordml" xmlns:w16se="http://schemas.microsoft.com/office/word/2015/wordml/symex" xmlns:wpg="http://schemas.microsoft.com/office/word/2010/wordprocessingGroup" xmlns:wpi="http://schemas.microsoft.com/office/word/2010/wordprocessingInk" xmlns:wne="http://schemas.microsoft.com/office/word/2006/wordml" xmlns:wps="http://schemas.microsoft.com/office/word/2010/wordprocessingShape" mc:Ignorable="w14 w15 w16se wp14">
+<w:endnotes xmlns:wpc="http://schemas.microsoft.com/office/word/2010/wordprocessingCanvas" xmlns:cx="http://schemas.microsoft.com/office/drawing/2014/chartex" xmlns:cx1="http://schemas.microsoft.com/office/drawing/2015/9/8/chartex" xmlns:cx2="http://schemas.microsoft.com/office/drawing/2015/10/21/chartex" xmlns:cx3="http://schemas.microsoft.com/office/drawing/2016/5/9/chartex" xmlns:cx4="http://schemas.microsoft.com/office/drawing/2016/5/10/chartex" xmlns:cx5="http://schemas.microsoft.com/office/drawing/2016/5/11/chartex" xmlns:cx6="http://schemas.microsoft.com/office/drawing/2016/5/12/chartex" xmlns:cx7="http://schemas.microsoft.com/office/drawing/2016/5/13/chartex" xmlns:cx8="http://schemas.microsoft.com/office/drawing/2016/5/14/chartex" xmlns:mc="http://schemas.openxmlformats.org/markup-compatibility/2006" xmlns:aink="http://schemas.microsoft.com/office/drawing/2016/ink" xmlns:am3d="http://schemas.microsoft.com/office/drawing/2017/model3d" xmlns:o="urn:schemas-microsoft-com:office:office" xmlns:oel="http://schemas.microsoft.com/office/2019/extlst" xmlns:r="http://schemas.openxmlformats.org/officeDocument/2006/relationships" xmlns:m="http://schemas.openxmlformats.org/officeDocument/2006/math" xmlns:v="urn:schemas-microsoft-com:vml" xmlns:wp14="http://schemas.microsoft.com/office/word/2010/wordprocessingDrawing" xmlns:wp="http://schemas.openxmlformats.org/drawingml/2006/wordprocessingDrawing" xmlns:w10="urn:schemas-microsoft-com:office:word" xmlns:w="http://schemas.openxmlformats.org/wordprocessingml/2006/main" xmlns:w14="http://schemas.microsoft.com/office/word/2010/wordml" xmlns:w15="http://schemas.microsoft.com/office/word/2012/wordml" xmlns:w16cex="http://schemas.microsoft.com/office/word/2018/wordml/cex" xmlns:w16cid="http://schemas.microsoft.com/office/word/2016/wordml/cid" xmlns:w16="http://schemas.microsoft.com/office/word/2018/wordml" xmlns:w16du="http://schemas.microsoft.com/office/word/2023/wordml/word16du" xmlns:w16sdtdh="http://schemas.microsoft.com/office/word/2020/wordml/sdtdatahash" xmlns:w16sdtfl="http://schemas.microsoft.com/office/word/2024/wordml/sdtformatlock" xmlns:w16se="http://schemas.microsoft.com/office/word/2015/wordml/symex" xmlns:wpg="http://schemas.microsoft.com/office/word/2010/wordprocessingGroup" xmlns:wpi="http://schemas.microsoft.com/office/word/2010/wordprocessingInk" xmlns:wne="http://schemas.microsoft.com/office/word/2006/wordml" xmlns:wps="http://schemas.microsoft.com/office/word/2010/wordprocessingShape" mc:Ignorable="w14 w15 w16se w16cid w16 w16cex w16sdtdh w16sdtfl w16du wp14">
   <w:endnote w:type="separator" w:id="-1">
     <w:p>
       <w:pPr>
@@ -2238,7 +1856,7 @@
 </file>
 
 <file path=word/footer1.xml><?xml version="1.0" encoding="utf-8"?>
-<w:ftr xmlns:wpc="http://schemas.microsoft.com/office/word/2010/wordprocessingCanvas" xmlns:cx="http://schemas.microsoft.com/office/drawing/2014/chartex" xmlns:mc="http://schemas.openxmlformats.org/markup-compatibility/2006" xmlns:o="urn:schemas-microsoft-com:office:office" xmlns:r="http://schemas.openxmlformats.org/officeDocument/2006/relationships" xmlns:m="http://schemas.openxmlformats.org/officeDocument/2006/math" xmlns:v="urn:schemas-microsoft-com:vml" xmlns:wp14="http://schemas.microsoft.com/office/word/2010/wordprocessingDrawing" xmlns:wp="http://schemas.openxmlformats.org/drawingml/2006/wordprocessingDrawing" xmlns:w10="urn:schemas-microsoft-com:office:word" xmlns:w="http://schemas.openxmlformats.org/wordprocessingml/2006/main" xmlns:w14="http://schemas.microsoft.com/office/word/2010/wordml" xmlns:w15="http://schemas.microsoft.com/office/word/2012/wordml" xmlns:w16se="http://schemas.microsoft.com/office/word/2015/wordml/symex" xmlns:wpg="http://schemas.microsoft.com/office/word/2010/wordprocessingGroup" xmlns:wpi="http://schemas.microsoft.com/office/word/2010/wordprocessingInk" xmlns:wne="http://schemas.microsoft.com/office/word/2006/wordml" xmlns:wps="http://schemas.microsoft.com/office/word/2010/wordprocessingShape" mc:Ignorable="w14 w15 w16se wp14">
+<w:ftr xmlns:wpc="http://schemas.microsoft.com/office/word/2010/wordprocessingCanvas" xmlns:cx="http://schemas.microsoft.com/office/drawing/2014/chartex" xmlns:cx1="http://schemas.microsoft.com/office/drawing/2015/9/8/chartex" xmlns:cx2="http://schemas.microsoft.com/office/drawing/2015/10/21/chartex" xmlns:cx3="http://schemas.microsoft.com/office/drawing/2016/5/9/chartex" xmlns:cx4="http://schemas.microsoft.com/office/drawing/2016/5/10/chartex" xmlns:cx5="http://schemas.microsoft.com/office/drawing/2016/5/11/chartex" xmlns:cx6="http://schemas.microsoft.com/office/drawing/2016/5/12/chartex" xmlns:cx7="http://schemas.microsoft.com/office/drawing/2016/5/13/chartex" xmlns:cx8="http://schemas.microsoft.com/office/drawing/2016/5/14/chartex" xmlns:mc="http://schemas.openxmlformats.org/markup-compatibility/2006" xmlns:aink="http://schemas.microsoft.com/office/drawing/2016/ink" xmlns:am3d="http://schemas.microsoft.com/office/drawing/2017/model3d" xmlns:o="urn:schemas-microsoft-com:office:office" xmlns:oel="http://schemas.microsoft.com/office/2019/extlst" xmlns:r="http://schemas.openxmlformats.org/officeDocument/2006/relationships" xmlns:m="http://schemas.openxmlformats.org/officeDocument/2006/math" xmlns:v="urn:schemas-microsoft-com:vml" xmlns:wp14="http://schemas.microsoft.com/office/word/2010/wordprocessingDrawing" xmlns:wp="http://schemas.openxmlformats.org/drawingml/2006/wordprocessingDrawing" xmlns:w10="urn:schemas-microsoft-com:office:word" xmlns:w="http://schemas.openxmlformats.org/wordprocessingml/2006/main" xmlns:w14="http://schemas.microsoft.com/office/word/2010/wordml" xmlns:w15="http://schemas.microsoft.com/office/word/2012/wordml" xmlns:w16cex="http://schemas.microsoft.com/office/word/2018/wordml/cex" xmlns:w16cid="http://schemas.microsoft.com/office/word/2016/wordml/cid" xmlns:w16="http://schemas.microsoft.com/office/word/2018/wordml" xmlns:w16du="http://schemas.microsoft.com/office/word/2023/wordml/word16du" xmlns:w16sdtdh="http://schemas.microsoft.com/office/word/2020/wordml/sdtdatahash" xmlns:w16sdtfl="http://schemas.microsoft.com/office/word/2024/wordml/sdtformatlock" xmlns:w16se="http://schemas.microsoft.com/office/word/2015/wordml/symex" xmlns:wpg="http://schemas.microsoft.com/office/word/2010/wordprocessingGroup" xmlns:wpi="http://schemas.microsoft.com/office/word/2010/wordprocessingInk" xmlns:wne="http://schemas.microsoft.com/office/word/2006/wordml" xmlns:wps="http://schemas.microsoft.com/office/word/2010/wordprocessingShape" mc:Ignorable="w14 w15 w16se w16cid w16 w16cex w16sdtdh w16sdtfl w16du wp14">
   <w:sdt>
     <w:sdtPr>
       <w:id w:val="-937982979"/>
@@ -2247,7 +1865,6 @@
         <w:docPartUnique/>
       </w:docPartObj>
     </w:sdtPr>
-    <w:sdtEndPr/>
     <w:sdtContent>
       <w:p>
         <w:pPr>
@@ -2459,7 +2076,7 @@
             </mc:Choice>
             <mc:Fallback>
               <w:pict>
-                <v:group w14:anchorId="51D00065" id="Grupo 32" o:spid="_x0000_s1026" style="position:absolute;margin-left:0;margin-top:0;width:610.5pt;height:15pt;z-index:251659264;mso-width-percent:1000;mso-position-horizontal:center;mso-position-horizontal-relative:page;mso-position-vertical:center;mso-position-vertical-relative:bottom-margin-area;mso-width-percent:1000" coordorigin=",14970" coordsize="12255,300" o:gfxdata="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">
+                <v:group w14:anchorId="51D00065" id="Grupo 32" o:spid="_x0000_s1026" style="position:absolute;margin-left:0;margin-top:0;width:610.5pt;height:15pt;z-index:251659264;mso-width-percent:1000;mso-position-horizontal:center;mso-position-horizontal-relative:page;mso-position-vertical:center;mso-position-vertical-relative:bottom-margin-area;mso-width-percent:1000" coordorigin=",14970" coordsize="12255,300" o:gfxdata="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">
                   <v:shapetype id="_x0000_t202" coordsize="21600,21600" o:spt="202" path="m,l,21600r21600,l21600,xe">
                     <v:stroke joinstyle="miter"/>
                     <v:path gradientshapeok="t" o:connecttype="rect"/>
@@ -2526,7 +2143,7 @@
 </file>
 
 <file path=word/footnotes.xml><?xml version="1.0" encoding="utf-8"?>
-<w:footnotes xmlns:wpc="http://schemas.microsoft.com/office/word/2010/wordprocessingCanvas" xmlns:cx="http://schemas.microsoft.com/office/drawing/2014/chartex" xmlns:mc="http://schemas.openxmlformats.org/markup-compatibility/2006" xmlns:o="urn:schemas-microsoft-com:office:office" xmlns:r="http://schemas.openxmlformats.org/officeDocument/2006/relationships" xmlns:m="http://schemas.openxmlformats.org/officeDocument/2006/math" xmlns:v="urn:schemas-microsoft-com:vml" xmlns:wp14="http://schemas.microsoft.com/office/word/2010/wordprocessingDrawing" xmlns:wp="http://schemas.openxmlformats.org/drawingml/2006/wordprocessingDrawing" xmlns:w10="urn:schemas-microsoft-com:office:word" xmlns:w="http://schemas.openxmlformats.org/wordprocessingml/2006/main" xmlns:w14="http://schemas.microsoft.com/office/word/2010/wordml" xmlns:w15="http://schemas.microsoft.com/office/word/2012/wordml" xmlns:w16se="http://schemas.microsoft.com/office/word/2015/wordml/symex" xmlns:wpg="http://schemas.microsoft.com/office/word/2010/wordprocessingGroup" xmlns:wpi="http://schemas.microsoft.com/office/word/2010/wordprocessingInk" xmlns:wne="http://schemas.microsoft.com/office/word/2006/wordml" xmlns:wps="http://schemas.microsoft.com/office/word/2010/wordprocessingShape" mc:Ignorable="w14 w15 w16se wp14">
+<w:footnotes xmlns:wpc="http://schemas.microsoft.com/office/word/2010/wordprocessingCanvas" xmlns:cx="http://schemas.microsoft.com/office/drawing/2014/chartex" xmlns:cx1="http://schemas.microsoft.com/office/drawing/2015/9/8/chartex" xmlns:cx2="http://schemas.microsoft.com/office/drawing/2015/10/21/chartex" xmlns:cx3="http://schemas.microsoft.com/office/drawing/2016/5/9/chartex" xmlns:cx4="http://schemas.microsoft.com/office/drawing/2016/5/10/chartex" xmlns:cx5="http://schemas.microsoft.com/office/drawing/2016/5/11/chartex" xmlns:cx6="http://schemas.microsoft.com/office/drawing/2016/5/12/chartex" xmlns:cx7="http://schemas.microsoft.com/office/drawing/2016/5/13/chartex" xmlns:cx8="http://schemas.microsoft.com/office/drawing/2016/5/14/chartex" xmlns:mc="http://schemas.openxmlformats.org/markup-compatibility/2006" xmlns:aink="http://schemas.microsoft.com/office/drawing/2016/ink" xmlns:am3d="http://schemas.microsoft.com/office/drawing/2017/model3d" xmlns:o="urn:schemas-microsoft-com:office:office" xmlns:oel="http://schemas.microsoft.com/office/2019/extlst" xmlns:r="http://schemas.openxmlformats.org/officeDocument/2006/relationships" xmlns:m="http://schemas.openxmlformats.org/officeDocument/2006/math" xmlns:v="urn:schemas-microsoft-com:vml" xmlns:wp14="http://schemas.microsoft.com/office/word/2010/wordprocessingDrawing" xmlns:wp="http://schemas.openxmlformats.org/drawingml/2006/wordprocessingDrawing" xmlns:w10="urn:schemas-microsoft-com:office:word" xmlns:w="http://schemas.openxmlformats.org/wordprocessingml/2006/main" xmlns:w14="http://schemas.microsoft.com/office/word/2010/wordml" xmlns:w15="http://schemas.microsoft.com/office/word/2012/wordml" xmlns:w16cex="http://schemas.microsoft.com/office/word/2018/wordml/cex" xmlns:w16cid="http://schemas.microsoft.com/office/word/2016/wordml/cid" xmlns:w16="http://schemas.microsoft.com/office/word/2018/wordml" xmlns:w16du="http://schemas.microsoft.com/office/word/2023/wordml/word16du" xmlns:w16sdtdh="http://schemas.microsoft.com/office/word/2020/wordml/sdtdatahash" xmlns:w16sdtfl="http://schemas.microsoft.com/office/word/2024/wordml/sdtformatlock" xmlns:w16se="http://schemas.microsoft.com/office/word/2015/wordml/symex" xmlns:wpg="http://schemas.microsoft.com/office/word/2010/wordprocessingGroup" xmlns:wpi="http://schemas.microsoft.com/office/word/2010/wordprocessingInk" xmlns:wne="http://schemas.microsoft.com/office/word/2006/wordml" xmlns:wps="http://schemas.microsoft.com/office/word/2010/wordprocessingShape" mc:Ignorable="w14 w15 w16se w16cid w16 w16cex w16sdtdh w16sdtfl w16du wp14">
   <w:footnote w:type="separator" w:id="-1">
     <w:p>
       <w:pPr>
@@ -2551,7 +2168,7 @@
 </file>
 
 <file path=word/header1.xml><?xml version="1.0" encoding="utf-8"?>
-<w:hdr xmlns:wpc="http://schemas.microsoft.com/office/word/2010/wordprocessingCanvas" xmlns:cx="http://schemas.microsoft.com/office/drawing/2014/chartex" xmlns:mc="http://schemas.openxmlformats.org/markup-compatibility/2006" xmlns:o="urn:schemas-microsoft-com:office:office" xmlns:r="http://schemas.openxmlformats.org/officeDocument/2006/relationships" xmlns:m="http://schemas.openxmlformats.org/officeDocument/2006/math" xmlns:v="urn:schemas-microsoft-com:vml" xmlns:wp14="http://schemas.microsoft.com/office/word/2010/wordprocessingDrawing" xmlns:wp="http://schemas.openxmlformats.org/drawingml/2006/wordprocessingDrawing" xmlns:w10="urn:schemas-microsoft-com:office:word" xmlns:w="http://schemas.openxmlformats.org/wordprocessingml/2006/main" xmlns:w14="http://schemas.microsoft.com/office/word/2010/wordml" xmlns:w15="http://schemas.microsoft.com/office/word/2012/wordml" xmlns:w16se="http://schemas.microsoft.com/office/word/2015/wordml/symex" xmlns:wpg="http://schemas.microsoft.com/office/word/2010/wordprocessingGroup" xmlns:wpi="http://schemas.microsoft.com/office/word/2010/wordprocessingInk" xmlns:wne="http://schemas.microsoft.com/office/word/2006/wordml" xmlns:wps="http://schemas.microsoft.com/office/word/2010/wordprocessingShape" mc:Ignorable="w14 w15 w16se wp14">
+<w:hdr xmlns:wpc="http://schemas.microsoft.com/office/word/2010/wordprocessingCanvas" xmlns:cx="http://schemas.microsoft.com/office/drawing/2014/chartex" xmlns:cx1="http://schemas.microsoft.com/office/drawing/2015/9/8/chartex" xmlns:cx2="http://schemas.microsoft.com/office/drawing/2015/10/21/chartex" xmlns:cx3="http://schemas.microsoft.com/office/drawing/2016/5/9/chartex" xmlns:cx4="http://schemas.microsoft.com/office/drawing/2016/5/10/chartex" xmlns:cx5="http://schemas.microsoft.com/office/drawing/2016/5/11/chartex" xmlns:cx6="http://schemas.microsoft.com/office/drawing/2016/5/12/chartex" xmlns:cx7="http://schemas.microsoft.com/office/drawing/2016/5/13/chartex" xmlns:cx8="http://schemas.microsoft.com/office/drawing/2016/5/14/chartex" xmlns:mc="http://schemas.openxmlformats.org/markup-compatibility/2006" xmlns:aink="http://schemas.microsoft.com/office/drawing/2016/ink" xmlns:am3d="http://schemas.microsoft.com/office/drawing/2017/model3d" xmlns:o="urn:schemas-microsoft-com:office:office" xmlns:oel="http://schemas.microsoft.com/office/2019/extlst" xmlns:r="http://schemas.openxmlformats.org/officeDocument/2006/relationships" xmlns:m="http://schemas.openxmlformats.org/officeDocument/2006/math" xmlns:v="urn:schemas-microsoft-com:vml" xmlns:wp14="http://schemas.microsoft.com/office/word/2010/wordprocessingDrawing" xmlns:wp="http://schemas.openxmlformats.org/drawingml/2006/wordprocessingDrawing" xmlns:w10="urn:schemas-microsoft-com:office:word" xmlns:w="http://schemas.openxmlformats.org/wordprocessingml/2006/main" xmlns:w14="http://schemas.microsoft.com/office/word/2010/wordml" xmlns:w15="http://schemas.microsoft.com/office/word/2012/wordml" xmlns:w16cex="http://schemas.microsoft.com/office/word/2018/wordml/cex" xmlns:w16cid="http://schemas.microsoft.com/office/word/2016/wordml/cid" xmlns:w16="http://schemas.microsoft.com/office/word/2018/wordml" xmlns:w16du="http://schemas.microsoft.com/office/word/2023/wordml/word16du" xmlns:w16sdtdh="http://schemas.microsoft.com/office/word/2020/wordml/sdtdatahash" xmlns:w16sdtfl="http://schemas.microsoft.com/office/word/2024/wordml/sdtformatlock" xmlns:w16se="http://schemas.microsoft.com/office/word/2015/wordml/symex" xmlns:wpg="http://schemas.microsoft.com/office/word/2010/wordprocessingGroup" xmlns:wpi="http://schemas.microsoft.com/office/word/2010/wordprocessingInk" xmlns:wne="http://schemas.microsoft.com/office/word/2006/wordml" xmlns:wps="http://schemas.microsoft.com/office/word/2010/wordprocessingShape" mc:Ignorable="w14 w15 w16se w16cid w16 w16cex w16sdtdh w16sdtfl w16du wp14">
   <w:tbl>
     <w:tblPr>
       <w:tblStyle w:val="Tablaconcuadrcula"/>
@@ -2721,7 +2338,7 @@
 </file>
 
 <file path=word/header2.xml><?xml version="1.0" encoding="utf-8"?>
-<w:hdr xmlns:wpc="http://schemas.microsoft.com/office/word/2010/wordprocessingCanvas" xmlns:cx="http://schemas.microsoft.com/office/drawing/2014/chartex" xmlns:mc="http://schemas.openxmlformats.org/markup-compatibility/2006" xmlns:o="urn:schemas-microsoft-com:office:office" xmlns:r="http://schemas.openxmlformats.org/officeDocument/2006/relationships" xmlns:m="http://schemas.openxmlformats.org/officeDocument/2006/math" xmlns:v="urn:schemas-microsoft-com:vml" xmlns:wp14="http://schemas.microsoft.com/office/word/2010/wordprocessingDrawing" xmlns:wp="http://schemas.openxmlformats.org/drawingml/2006/wordprocessingDrawing" xmlns:w10="urn:schemas-microsoft-com:office:word" xmlns:w="http://schemas.openxmlformats.org/wordprocessingml/2006/main" xmlns:w14="http://schemas.microsoft.com/office/word/2010/wordml" xmlns:w15="http://schemas.microsoft.com/office/word/2012/wordml" xmlns:w16se="http://schemas.microsoft.com/office/word/2015/wordml/symex" xmlns:wpg="http://schemas.microsoft.com/office/word/2010/wordprocessingGroup" xmlns:wpi="http://schemas.microsoft.com/office/word/2010/wordprocessingInk" xmlns:wne="http://schemas.microsoft.com/office/word/2006/wordml" xmlns:wps="http://schemas.microsoft.com/office/word/2010/wordprocessingShape" mc:Ignorable="w14 w15 w16se wp14">
+<w:hdr xmlns:wpc="http://schemas.microsoft.com/office/word/2010/wordprocessingCanvas" xmlns:cx="http://schemas.microsoft.com/office/drawing/2014/chartex" xmlns:cx1="http://schemas.microsoft.com/office/drawing/2015/9/8/chartex" xmlns:cx2="http://schemas.microsoft.com/office/drawing/2015/10/21/chartex" xmlns:cx3="http://schemas.microsoft.com/office/drawing/2016/5/9/chartex" xmlns:cx4="http://schemas.microsoft.com/office/drawing/2016/5/10/chartex" xmlns:cx5="http://schemas.microsoft.com/office/drawing/2016/5/11/chartex" xmlns:cx6="http://schemas.microsoft.com/office/drawing/2016/5/12/chartex" xmlns:cx7="http://schemas.microsoft.com/office/drawing/2016/5/13/chartex" xmlns:cx8="http://schemas.microsoft.com/office/drawing/2016/5/14/chartex" xmlns:mc="http://schemas.openxmlformats.org/markup-compatibility/2006" xmlns:aink="http://schemas.microsoft.com/office/drawing/2016/ink" xmlns:am3d="http://schemas.microsoft.com/office/drawing/2017/model3d" xmlns:o="urn:schemas-microsoft-com:office:office" xmlns:oel="http://schemas.microsoft.com/office/2019/extlst" xmlns:r="http://schemas.openxmlformats.org/officeDocument/2006/relationships" xmlns:m="http://schemas.openxmlformats.org/officeDocument/2006/math" xmlns:v="urn:schemas-microsoft-com:vml" xmlns:wp14="http://schemas.microsoft.com/office/word/2010/wordprocessingDrawing" xmlns:wp="http://schemas.openxmlformats.org/drawingml/2006/wordprocessingDrawing" xmlns:w10="urn:schemas-microsoft-com:office:word" xmlns:w="http://schemas.openxmlformats.org/wordprocessingml/2006/main" xmlns:w14="http://schemas.microsoft.com/office/word/2010/wordml" xmlns:w15="http://schemas.microsoft.com/office/word/2012/wordml" xmlns:w16cex="http://schemas.microsoft.com/office/word/2018/wordml/cex" xmlns:w16cid="http://schemas.microsoft.com/office/word/2016/wordml/cid" xmlns:w16="http://schemas.microsoft.com/office/word/2018/wordml" xmlns:w16du="http://schemas.microsoft.com/office/word/2023/wordml/word16du" xmlns:w16sdtdh="http://schemas.microsoft.com/office/word/2020/wordml/sdtdatahash" xmlns:w16sdtfl="http://schemas.microsoft.com/office/word/2024/wordml/sdtformatlock" xmlns:w16se="http://schemas.microsoft.com/office/word/2015/wordml/symex" xmlns:wpg="http://schemas.microsoft.com/office/word/2010/wordprocessingGroup" xmlns:wpi="http://schemas.microsoft.com/office/word/2010/wordprocessingInk" xmlns:wne="http://schemas.microsoft.com/office/word/2006/wordml" xmlns:wps="http://schemas.microsoft.com/office/word/2010/wordprocessingShape" mc:Ignorable="w14 w15 w16se w16cid w16 w16cex w16sdtdh w16sdtfl w16du wp14">
   <w:tbl>
     <w:tblPr>
       <w:tblStyle w:val="Tablaconcuadrcula"/>
@@ -2994,7 +2611,7 @@
 </file>
 
 <file path=word/numbering.xml><?xml version="1.0" encoding="utf-8"?>
-<w:numbering xmlns:wpc="http://schemas.microsoft.com/office/word/2010/wordprocessingCanvas" xmlns:cx="http://schemas.microsoft.com/office/drawing/2014/chartex" xmlns:mc="http://schemas.openxmlformats.org/markup-compatibility/2006" xmlns:o="urn:schemas-microsoft-com:office:office" xmlns:r="http://schemas.openxmlformats.org/officeDocument/2006/relationships" xmlns:m="http://schemas.openxmlformats.org/officeDocument/2006/math" xmlns:v="urn:schemas-microsoft-com:vml" xmlns:wp14="http://schemas.microsoft.com/office/word/2010/wordprocessingDrawing" xmlns:wp="http://schemas.openxmlformats.org/drawingml/2006/wordprocessingDrawing" xmlns:w10="urn:schemas-microsoft-com:office:word" xmlns:w="http://schemas.openxmlformats.org/wordprocessingml/2006/main" xmlns:w14="http://schemas.microsoft.com/office/word/2010/wordml" xmlns:w15="http://schemas.microsoft.com/office/word/2012/wordml" xmlns:w16se="http://schemas.microsoft.com/office/word/2015/wordml/symex" xmlns:wpg="http://schemas.microsoft.com/office/word/2010/wordprocessingGroup" xmlns:wpi="http://schemas.microsoft.com/office/word/2010/wordprocessingInk" xmlns:wne="http://schemas.microsoft.com/office/word/2006/wordml" xmlns:wps="http://schemas.microsoft.com/office/word/2010/wordprocessingShape" mc:Ignorable="w14 w15 w16se wp14">
+<w:numbering xmlns:wpc="http://schemas.microsoft.com/office/word/2010/wordprocessingCanvas" xmlns:cx="http://schemas.microsoft.com/office/drawing/2014/chartex" xmlns:cx1="http://schemas.microsoft.com/office/drawing/2015/9/8/chartex" xmlns:cx2="http://schemas.microsoft.com/office/drawing/2015/10/21/chartex" xmlns:cx3="http://schemas.microsoft.com/office/drawing/2016/5/9/chartex" xmlns:cx4="http://schemas.microsoft.com/office/drawing/2016/5/10/chartex" xmlns:cx5="http://schemas.microsoft.com/office/drawing/2016/5/11/chartex" xmlns:cx6="http://schemas.microsoft.com/office/drawing/2016/5/12/chartex" xmlns:cx7="http://schemas.microsoft.com/office/drawing/2016/5/13/chartex" xmlns:cx8="http://schemas.microsoft.com/office/drawing/2016/5/14/chartex" xmlns:mc="http://schemas.openxmlformats.org/markup-compatibility/2006" xmlns:aink="http://schemas.microsoft.com/office/drawing/2016/ink" xmlns:am3d="http://schemas.microsoft.com/office/drawing/2017/model3d" xmlns:o="urn:schemas-microsoft-com:office:office" xmlns:oel="http://schemas.microsoft.com/office/2019/extlst" xmlns:r="http://schemas.openxmlformats.org/officeDocument/2006/relationships" xmlns:m="http://schemas.openxmlformats.org/officeDocument/2006/math" xmlns:v="urn:schemas-microsoft-com:vml" xmlns:wp14="http://schemas.microsoft.com/office/word/2010/wordprocessingDrawing" xmlns:wp="http://schemas.openxmlformats.org/drawingml/2006/wordprocessingDrawing" xmlns:w10="urn:schemas-microsoft-com:office:word" xmlns:w="http://schemas.openxmlformats.org/wordprocessingml/2006/main" xmlns:w14="http://schemas.microsoft.com/office/word/2010/wordml" xmlns:w15="http://schemas.microsoft.com/office/word/2012/wordml" xmlns:w16cex="http://schemas.microsoft.com/office/word/2018/wordml/cex" xmlns:w16cid="http://schemas.microsoft.com/office/word/2016/wordml/cid" xmlns:w16="http://schemas.microsoft.com/office/word/2018/wordml" xmlns:w16du="http://schemas.microsoft.com/office/word/2023/wordml/word16du" xmlns:w16sdtdh="http://schemas.microsoft.com/office/word/2020/wordml/sdtdatahash" xmlns:w16sdtfl="http://schemas.microsoft.com/office/word/2024/wordml/sdtformatlock" xmlns:w16se="http://schemas.microsoft.com/office/word/2015/wordml/symex" xmlns:wpg="http://schemas.microsoft.com/office/word/2010/wordprocessingGroup" xmlns:wpi="http://schemas.microsoft.com/office/word/2010/wordprocessingInk" xmlns:wne="http://schemas.microsoft.com/office/word/2006/wordml" xmlns:wps="http://schemas.microsoft.com/office/word/2010/wordprocessingShape" mc:Ignorable="w14 w15 w16se w16cid w16 w16cex w16sdtdh w16sdtfl w16du wp14">
   <w:abstractNum w:abstractNumId="0" w15:restartNumberingAfterBreak="0">
     <w:nsid w:val="049156A1"/>
     <w:multiLevelType w:val="hybridMultilevel"/>
@@ -7568,124 +7185,124 @@
       </w:rPr>
     </w:lvl>
   </w:abstractNum>
-  <w:num w:numId="1">
+  <w:num w:numId="1" w16cid:durableId="822935799">
     <w:abstractNumId w:val="3"/>
   </w:num>
-  <w:num w:numId="2">
+  <w:num w:numId="2" w16cid:durableId="181940291">
     <w:abstractNumId w:val="8"/>
   </w:num>
-  <w:num w:numId="3">
+  <w:num w:numId="3" w16cid:durableId="153496233">
     <w:abstractNumId w:val="12"/>
   </w:num>
-  <w:num w:numId="4">
+  <w:num w:numId="4" w16cid:durableId="843010666">
     <w:abstractNumId w:val="28"/>
   </w:num>
-  <w:num w:numId="5">
+  <w:num w:numId="5" w16cid:durableId="1424494900">
     <w:abstractNumId w:val="30"/>
   </w:num>
-  <w:num w:numId="6">
+  <w:num w:numId="6" w16cid:durableId="585651419">
     <w:abstractNumId w:val="4"/>
   </w:num>
-  <w:num w:numId="7">
+  <w:num w:numId="7" w16cid:durableId="791175163">
     <w:abstractNumId w:val="11"/>
   </w:num>
-  <w:num w:numId="8">
+  <w:num w:numId="8" w16cid:durableId="1920865335">
     <w:abstractNumId w:val="19"/>
   </w:num>
-  <w:num w:numId="9">
+  <w:num w:numId="9" w16cid:durableId="1953315484">
     <w:abstractNumId w:val="15"/>
   </w:num>
-  <w:num w:numId="10">
+  <w:num w:numId="10" w16cid:durableId="380251226">
     <w:abstractNumId w:val="9"/>
   </w:num>
-  <w:num w:numId="11">
+  <w:num w:numId="11" w16cid:durableId="1021666864">
     <w:abstractNumId w:val="24"/>
   </w:num>
-  <w:num w:numId="12">
+  <w:num w:numId="12" w16cid:durableId="677776248">
     <w:abstractNumId w:val="35"/>
   </w:num>
-  <w:num w:numId="13">
+  <w:num w:numId="13" w16cid:durableId="28378318">
     <w:abstractNumId w:val="29"/>
   </w:num>
-  <w:num w:numId="14">
+  <w:num w:numId="14" w16cid:durableId="251357494">
     <w:abstractNumId w:val="1"/>
   </w:num>
-  <w:num w:numId="15">
+  <w:num w:numId="15" w16cid:durableId="427890967">
     <w:abstractNumId w:val="36"/>
   </w:num>
-  <w:num w:numId="16">
+  <w:num w:numId="16" w16cid:durableId="2016033907">
     <w:abstractNumId w:val="21"/>
   </w:num>
-  <w:num w:numId="17">
+  <w:num w:numId="17" w16cid:durableId="107699564">
     <w:abstractNumId w:val="17"/>
   </w:num>
-  <w:num w:numId="18">
+  <w:num w:numId="18" w16cid:durableId="1148977950">
     <w:abstractNumId w:val="31"/>
   </w:num>
-  <w:num w:numId="19">
+  <w:num w:numId="19" w16cid:durableId="1248273697">
     <w:abstractNumId w:val="10"/>
   </w:num>
-  <w:num w:numId="20">
+  <w:num w:numId="20" w16cid:durableId="679701338">
     <w:abstractNumId w:val="39"/>
   </w:num>
-  <w:num w:numId="21">
+  <w:num w:numId="21" w16cid:durableId="575480022">
     <w:abstractNumId w:val="34"/>
   </w:num>
-  <w:num w:numId="22">
+  <w:num w:numId="22" w16cid:durableId="406536531">
     <w:abstractNumId w:val="13"/>
   </w:num>
-  <w:num w:numId="23">
+  <w:num w:numId="23" w16cid:durableId="1750077123">
     <w:abstractNumId w:val="14"/>
   </w:num>
-  <w:num w:numId="24">
+  <w:num w:numId="24" w16cid:durableId="1367021730">
     <w:abstractNumId w:val="5"/>
   </w:num>
-  <w:num w:numId="25">
+  <w:num w:numId="25" w16cid:durableId="1223253743">
     <w:abstractNumId w:val="16"/>
   </w:num>
-  <w:num w:numId="26">
+  <w:num w:numId="26" w16cid:durableId="180171758">
     <w:abstractNumId w:val="20"/>
   </w:num>
-  <w:num w:numId="27">
+  <w:num w:numId="27" w16cid:durableId="1087921688">
     <w:abstractNumId w:val="23"/>
   </w:num>
-  <w:num w:numId="28">
+  <w:num w:numId="28" w16cid:durableId="1596134800">
     <w:abstractNumId w:val="0"/>
   </w:num>
-  <w:num w:numId="29">
+  <w:num w:numId="29" w16cid:durableId="222182212">
     <w:abstractNumId w:val="18"/>
   </w:num>
-  <w:num w:numId="30">
+  <w:num w:numId="30" w16cid:durableId="124128686">
     <w:abstractNumId w:val="22"/>
   </w:num>
-  <w:num w:numId="31">
+  <w:num w:numId="31" w16cid:durableId="2048945518">
     <w:abstractNumId w:val="2"/>
   </w:num>
-  <w:num w:numId="32">
+  <w:num w:numId="32" w16cid:durableId="348679960">
     <w:abstractNumId w:val="7"/>
   </w:num>
-  <w:num w:numId="33">
+  <w:num w:numId="33" w16cid:durableId="1118451608">
     <w:abstractNumId w:val="32"/>
   </w:num>
-  <w:num w:numId="34">
+  <w:num w:numId="34" w16cid:durableId="1679186284">
     <w:abstractNumId w:val="38"/>
   </w:num>
-  <w:num w:numId="35">
+  <w:num w:numId="35" w16cid:durableId="481970765">
     <w:abstractNumId w:val="6"/>
   </w:num>
-  <w:num w:numId="36">
+  <w:num w:numId="36" w16cid:durableId="577986587">
     <w:abstractNumId w:val="25"/>
   </w:num>
-  <w:num w:numId="37">
+  <w:num w:numId="37" w16cid:durableId="1960868560">
     <w:abstractNumId w:val="37"/>
   </w:num>
-  <w:num w:numId="38">
+  <w:num w:numId="38" w16cid:durableId="363798135">
     <w:abstractNumId w:val="27"/>
   </w:num>
-  <w:num w:numId="39">
+  <w:num w:numId="39" w16cid:durableId="1492478321">
     <w:abstractNumId w:val="26"/>
   </w:num>
-  <w:num w:numId="40">
+  <w:num w:numId="40" w16cid:durableId="822241557">
     <w:abstractNumId w:val="33"/>
   </w:num>
   <w:numIdMacAtCleanup w:val="18"/>
@@ -7693,7 +7310,7 @@
 </file>
 
 <file path=word/styles.xml><?xml version="1.0" encoding="utf-8"?>
-<w:styles xmlns:mc="http://schemas.openxmlformats.org/markup-compatibility/2006" xmlns:r="http://schemas.openxmlformats.org/officeDocument/2006/relationships" xmlns:w="http://schemas.openxmlformats.org/wordprocessingml/2006/main" xmlns:w14="http://schemas.microsoft.com/office/word/2010/wordml" xmlns:w15="http://schemas.microsoft.com/office/word/2012/wordml" xmlns:w16se="http://schemas.microsoft.com/office/word/2015/wordml/symex" mc:Ignorable="w14 w15 w16se">
+<w:styles xmlns:mc="http://schemas.openxmlformats.org/markup-compatibility/2006" xmlns:r="http://schemas.openxmlformats.org/officeDocument/2006/relationships" xmlns:w="http://schemas.openxmlformats.org/wordprocessingml/2006/main" xmlns:w14="http://schemas.microsoft.com/office/word/2010/wordml" xmlns:w15="http://schemas.microsoft.com/office/word/2012/wordml" xmlns:w16cex="http://schemas.microsoft.com/office/word/2018/wordml/cex" xmlns:w16cid="http://schemas.microsoft.com/office/word/2016/wordml/cid" xmlns:w16="http://schemas.microsoft.com/office/word/2018/wordml" xmlns:w16du="http://schemas.microsoft.com/office/word/2023/wordml/word16du" xmlns:w16sdtdh="http://schemas.microsoft.com/office/word/2020/wordml/sdtdatahash" xmlns:w16sdtfl="http://schemas.microsoft.com/office/word/2024/wordml/sdtformatlock" xmlns:w16se="http://schemas.microsoft.com/office/word/2015/wordml/symex" mc:Ignorable="w14 w15 w16se w16cid w16 w16cex w16sdtdh w16sdtfl w16du">
   <w:docDefaults>
     <w:rPrDefault>
       <w:rPr>
@@ -7709,7 +7326,7 @@
       </w:pPr>
     </w:pPrDefault>
   </w:docDefaults>
-  <w:latentStyles w:defLockedState="0" w:defUIPriority="99" w:defSemiHidden="0" w:defUnhideWhenUsed="0" w:defQFormat="0" w:count="371">
+  <w:latentStyles w:defLockedState="0" w:defUIPriority="99" w:defSemiHidden="0" w:defUnhideWhenUsed="0" w:defQFormat="0" w:count="376">
     <w:lsdException w:name="Normal" w:uiPriority="0" w:qFormat="1"/>
     <w:lsdException w:name="heading 1" w:uiPriority="9" w:qFormat="1"/>
     <w:lsdException w:name="heading 2" w:semiHidden="1" w:uiPriority="9" w:unhideWhenUsed="1" w:qFormat="1"/>
@@ -8081,6 +7698,11 @@
     <w:lsdException w:name="List Table 5 Dark Accent 6" w:uiPriority="50"/>
     <w:lsdException w:name="List Table 6 Colorful Accent 6" w:uiPriority="51"/>
     <w:lsdException w:name="List Table 7 Colorful Accent 6" w:uiPriority="52"/>
+    <w:lsdException w:name="Mention" w:semiHidden="1" w:unhideWhenUsed="1"/>
+    <w:lsdException w:name="Smart Hyperlink" w:semiHidden="1" w:unhideWhenUsed="1"/>
+    <w:lsdException w:name="Hashtag" w:semiHidden="1" w:unhideWhenUsed="1"/>
+    <w:lsdException w:name="Unresolved Mention" w:semiHidden="1" w:unhideWhenUsed="1"/>
+    <w:lsdException w:name="Smart Link" w:semiHidden="1" w:unhideWhenUsed="1"/>
   </w:latentStyles>
   <w:style w:type="paragraph" w:default="1" w:styleId="Normal">
     <w:name w:val="Normal"/>
@@ -8154,7 +7776,6 @@
   <w:style w:type="character" w:default="1" w:styleId="Fuentedeprrafopredeter">
     <w:name w:val="Default Paragraph Font"/>
     <w:uiPriority w:val="1"/>
-    <w:semiHidden/>
     <w:unhideWhenUsed/>
   </w:style>
   <w:style w:type="table" w:default="1" w:styleId="Tablanormal">
@@ -9064,7 +8685,7 @@
       <w:szCs w:val="24"/>
     </w:rPr>
   </w:style>
-  <w:style w:type="table" w:styleId="Cuadrculadetablaclara">
+  <w:style w:type="table" w:styleId="Tablaconcuadrculaclara">
     <w:name w:val="Grid Table Light"/>
     <w:basedOn w:val="Tablanormal"/>
     <w:uiPriority w:val="40"/>
@@ -9086,7 +8707,7 @@
   <w:style w:type="table" w:customStyle="1" w:styleId="Cuadrculadetablaclara1">
     <w:name w:val="Cuadrícula de tabla clara1"/>
     <w:basedOn w:val="Tablanormal"/>
-    <w:next w:val="Cuadrculadetablaclara"/>
+    <w:next w:val="Tablaconcuadrculaclara"/>
     <w:uiPriority w:val="40"/>
     <w:rsid w:val="00943DF1"/>
     <w:pPr>
@@ -9127,7 +8748,7 @@
       <w:spacing w:after="0" w:line="240" w:lineRule="auto"/>
     </w:pPr>
   </w:style>
-  <w:style w:type="character" w:styleId="Textoennegrita">
+  <w:style w:type="character" w:styleId="Fuerte">
     <w:name w:val="Strong"/>
     <w:basedOn w:val="Fuentedeprrafopredeter"/>
     <w:uiPriority w:val="22"/>
@@ -9139,532 +8760,6 @@
     </w:rPr>
   </w:style>
 </w:styles>
-</file>
-
-<file path=word/glossary/document.xml><?xml version="1.0" encoding="utf-8"?>
-<w:glossaryDocument xmlns:wpc="http://schemas.microsoft.com/office/word/2010/wordprocessingCanvas" xmlns:cx="http://schemas.microsoft.com/office/drawing/2014/chartex" xmlns:mc="http://schemas.openxmlformats.org/markup-compatibility/2006" xmlns:o="urn:schemas-microsoft-com:office:office" xmlns:r="http://schemas.openxmlformats.org/officeDocument/2006/relationships" xmlns:m="http://schemas.openxmlformats.org/officeDocument/2006/math" xmlns:v="urn:schemas-microsoft-com:vml" xmlns:wp14="http://schemas.microsoft.com/office/word/2010/wordprocessingDrawing" xmlns:wp="http://schemas.openxmlformats.org/drawingml/2006/wordprocessingDrawing" xmlns:w10="urn:schemas-microsoft-com:office:word" xmlns:w="http://schemas.openxmlformats.org/wordprocessingml/2006/main" xmlns:w14="http://schemas.microsoft.com/office/word/2010/wordml" xmlns:w15="http://schemas.microsoft.com/office/word/2012/wordml" xmlns:w16se="http://schemas.microsoft.com/office/word/2015/wordml/symex" xmlns:wpg="http://schemas.microsoft.com/office/word/2010/wordprocessingGroup" xmlns:wpi="http://schemas.microsoft.com/office/word/2010/wordprocessingInk" xmlns:wne="http://schemas.microsoft.com/office/word/2006/wordml" xmlns:wps="http://schemas.microsoft.com/office/word/2010/wordprocessingShape" mc:Ignorable="w14 w15 w16se wp14"/>
-</file>
-
-<file path=word/glossary/fontTable.xml><?xml version="1.0" encoding="utf-8"?>
-<w:fonts xmlns:mc="http://schemas.openxmlformats.org/markup-compatibility/2006" xmlns:r="http://schemas.openxmlformats.org/officeDocument/2006/relationships" xmlns:w="http://schemas.openxmlformats.org/wordprocessingml/2006/main" xmlns:w14="http://schemas.microsoft.com/office/word/2010/wordml" xmlns:w15="http://schemas.microsoft.com/office/word/2012/wordml" xmlns:w16se="http://schemas.microsoft.com/office/word/2015/wordml/symex" mc:Ignorable="w14 w15 w16se">
-  <w:font w:name="Calibri">
-    <w:panose1 w:val="020F0502020204030204"/>
-    <w:charset w:val="00"/>
-    <w:family w:val="swiss"/>
-    <w:pitch w:val="variable"/>
-    <w:sig w:usb0="E4002EFF" w:usb1="C000247B" w:usb2="00000009" w:usb3="00000000" w:csb0="000001FF" w:csb1="00000000"/>
-  </w:font>
-  <w:font w:name="Times New Roman">
-    <w:panose1 w:val="02020603050405020304"/>
-    <w:charset w:val="00"/>
-    <w:family w:val="roman"/>
-    <w:pitch w:val="variable"/>
-    <w:sig w:usb0="E0002EFF" w:usb1="C000785B" w:usb2="00000009" w:usb3="00000000" w:csb0="000001FF" w:csb1="00000000"/>
-  </w:font>
-  <w:font w:name="Courier New">
-    <w:panose1 w:val="02070309020205020404"/>
-    <w:charset w:val="00"/>
-    <w:family w:val="modern"/>
-    <w:pitch w:val="fixed"/>
-    <w:sig w:usb0="E0002EFF" w:usb1="C0007843" w:usb2="00000009" w:usb3="00000000" w:csb0="000001FF" w:csb1="00000000"/>
-  </w:font>
-  <w:font w:name="Wingdings">
-    <w:panose1 w:val="05000000000000000000"/>
-    <w:charset w:val="02"/>
-    <w:family w:val="auto"/>
-    <w:pitch w:val="variable"/>
-    <w:sig w:usb0="00000000" w:usb1="10000000" w:usb2="00000000" w:usb3="00000000" w:csb0="80000000" w:csb1="00000000"/>
-  </w:font>
-  <w:font w:name="Symbol">
-    <w:panose1 w:val="05050102010706020507"/>
-    <w:charset w:val="02"/>
-    <w:family w:val="roman"/>
-    <w:pitch w:val="variable"/>
-    <w:sig w:usb0="00000000" w:usb1="10000000" w:usb2="00000000" w:usb3="00000000" w:csb0="80000000" w:csb1="00000000"/>
-  </w:font>
-  <w:font w:name="Calibri Light">
-    <w:panose1 w:val="020F0302020204030204"/>
-    <w:charset w:val="00"/>
-    <w:family w:val="swiss"/>
-    <w:pitch w:val="variable"/>
-    <w:sig w:usb0="E4002EFF" w:usb1="C000247B" w:usb2="00000009" w:usb3="00000000" w:csb0="000001FF" w:csb1="00000000"/>
-  </w:font>
-  <w:font w:name="Segoe UI">
-    <w:panose1 w:val="020B0502040204020203"/>
-    <w:charset w:val="00"/>
-    <w:family w:val="swiss"/>
-    <w:pitch w:val="variable"/>
-    <w:sig w:usb0="E4002EFF" w:usb1="C000E47F" w:usb2="00000009" w:usb3="00000000" w:csb0="000001FF" w:csb1="00000000"/>
-  </w:font>
-  <w:font w:name="Century Gothic">
-    <w:panose1 w:val="020B0502020202020204"/>
-    <w:charset w:val="00"/>
-    <w:family w:val="swiss"/>
-    <w:pitch w:val="variable"/>
-    <w:sig w:usb0="00000287" w:usb1="00000000" w:usb2="00000000" w:usb3="00000000" w:csb0="0000009F" w:csb1="00000000"/>
-  </w:font>
-</w:fonts>
-</file>
-
-<file path=word/glossary/settings.xml><?xml version="1.0" encoding="utf-8"?>
-<w:settings xmlns:mc="http://schemas.openxmlformats.org/markup-compatibility/2006" xmlns:o="urn:schemas-microsoft-com:office:office" xmlns:r="http://schemas.openxmlformats.org/officeDocument/2006/relationships" xmlns:m="http://schemas.openxmlformats.org/officeDocument/2006/math" xmlns:v="urn:schemas-microsoft-com:vml" xmlns:w10="urn:schemas-microsoft-com:office:word" xmlns:w="http://schemas.openxmlformats.org/wordprocessingml/2006/main" xmlns:w14="http://schemas.microsoft.com/office/word/2010/wordml" xmlns:w15="http://schemas.microsoft.com/office/word/2012/wordml" xmlns:w16se="http://schemas.microsoft.com/office/word/2015/wordml/symex" xmlns:sl="http://schemas.openxmlformats.org/schemaLibrary/2006/main" mc:Ignorable="w14 w15 w16se">
-  <w:defaultTabStop w:val="708"/>
-  <w:hyphenationZone w:val="425"/>
-  <w:characterSpacingControl w:val="doNotCompress"/>
-  <w:compat>
-    <w:useFELayout/>
-    <w:compatSetting w:name="compatibilityMode" w:uri="http://schemas.microsoft.com/office/word" w:val="12"/>
-  </w:compat>
-  <w:rsids>
-    <w:rsidRoot w:val="004A7892"/>
-    <w:rsid w:val="004A7892"/>
-  </w:rsids>
-  <m:mathPr>
-    <m:mathFont m:val="Cambria Math"/>
-    <m:brkBin m:val="before"/>
-    <m:brkBinSub m:val="--"/>
-    <m:smallFrac m:val="0"/>
-    <m:dispDef/>
-    <m:lMargin m:val="0"/>
-    <m:rMargin m:val="0"/>
-    <m:defJc m:val="centerGroup"/>
-    <m:wrapIndent m:val="1440"/>
-    <m:intLim m:val="subSup"/>
-    <m:naryLim m:val="undOvr"/>
-  </m:mathPr>
-  <w:themeFontLang w:val="es-CL"/>
-  <w:clrSchemeMapping w:bg1="light1" w:t1="dark1" w:bg2="light2" w:t2="dark2" w:accent1="accent1" w:accent2="accent2" w:accent3="accent3" w:accent4="accent4" w:accent5="accent5" w:accent6="accent6" w:hyperlink="hyperlink" w:followedHyperlink="followedHyperlink"/>
-  <w:decimalSymbol w:val=","/>
-  <w:listSeparator w:val=";"/>
-</w:settings>
-</file>
-
-<file path=word/glossary/styles.xml><?xml version="1.0" encoding="utf-8"?>
-<w:styles xmlns:mc="http://schemas.openxmlformats.org/markup-compatibility/2006" xmlns:r="http://schemas.openxmlformats.org/officeDocument/2006/relationships" xmlns:w="http://schemas.openxmlformats.org/wordprocessingml/2006/main" xmlns:w14="http://schemas.microsoft.com/office/word/2010/wordml" xmlns:w15="http://schemas.microsoft.com/office/word/2012/wordml" xmlns:w16se="http://schemas.microsoft.com/office/word/2015/wordml/symex" mc:Ignorable="w14 w15 w16se">
-  <w:docDefaults>
-    <w:rPrDefault>
-      <w:rPr>
-        <w:rFonts w:asciiTheme="minorHAnsi" w:eastAsiaTheme="minorEastAsia" w:hAnsiTheme="minorHAnsi" w:cstheme="minorBidi"/>
-        <w:sz w:val="22"/>
-        <w:szCs w:val="22"/>
-        <w:lang w:val="es-CL" w:eastAsia="es-CL" w:bidi="ar-SA"/>
-      </w:rPr>
-    </w:rPrDefault>
-    <w:pPrDefault>
-      <w:pPr>
-        <w:spacing w:after="160" w:line="259" w:lineRule="auto"/>
-      </w:pPr>
-    </w:pPrDefault>
-  </w:docDefaults>
-  <w:latentStyles w:defLockedState="0" w:defUIPriority="99" w:defSemiHidden="0" w:defUnhideWhenUsed="0" w:defQFormat="0" w:count="371">
-    <w:lsdException w:name="Normal" w:uiPriority="0" w:qFormat="1"/>
-    <w:lsdException w:name="heading 1" w:uiPriority="9" w:qFormat="1"/>
-    <w:lsdException w:name="heading 2" w:semiHidden="1" w:uiPriority="9" w:unhideWhenUsed="1" w:qFormat="1"/>
-    <w:lsdException w:name="heading 3" w:semiHidden="1" w:uiPriority="9" w:unhideWhenUsed="1" w:qFormat="1"/>
-    <w:lsdException w:name="heading 4" w:semiHidden="1" w:uiPriority="9" w:unhideWhenUsed="1" w:qFormat="1"/>
-    <w:lsdException w:name="heading 5" w:semiHidden="1" w:uiPriority="9" w:unhideWhenUsed="1" w:qFormat="1"/>
-    <w:lsdException w:name="heading 6" w:semiHidden="1" w:uiPriority="9" w:unhideWhenUsed="1" w:qFormat="1"/>
-    <w:lsdException w:name="heading 7" w:semiHidden="1" w:uiPriority="9" w:unhideWhenUsed="1" w:qFormat="1"/>
-    <w:lsdException w:name="heading 8" w:semiHidden="1" w:uiPriority="9" w:unhideWhenUsed="1" w:qFormat="1"/>
-    <w:lsdException w:name="heading 9" w:semiHidden="1" w:uiPriority="9" w:unhideWhenUsed="1" w:qFormat="1"/>
-    <w:lsdException w:name="index 1" w:semiHidden="1" w:unhideWhenUsed="1"/>
-    <w:lsdException w:name="index 2" w:semiHidden="1" w:unhideWhenUsed="1"/>
-    <w:lsdException w:name="index 3" w:semiHidden="1" w:unhideWhenUsed="1"/>
-    <w:lsdException w:name="index 4" w:semiHidden="1" w:unhideWhenUsed="1"/>
-    <w:lsdException w:name="index 5" w:semiHidden="1" w:unhideWhenUsed="1"/>
-    <w:lsdException w:name="index 6" w:semiHidden="1" w:unhideWhenUsed="1"/>
-    <w:lsdException w:name="index 7" w:semiHidden="1" w:unhideWhenUsed="1"/>
-    <w:lsdException w:name="index 8" w:semiHidden="1" w:unhideWhenUsed="1"/>
-    <w:lsdException w:name="index 9" w:semiHidden="1" w:unhideWhenUsed="1"/>
-    <w:lsdException w:name="toc 1" w:semiHidden="1" w:uiPriority="39" w:unhideWhenUsed="1"/>
-    <w:lsdException w:name="toc 2" w:semiHidden="1" w:uiPriority="39" w:unhideWhenUsed="1"/>
-    <w:lsdException w:name="toc 3" w:semiHidden="1" w:uiPriority="39" w:unhideWhenUsed="1"/>
-    <w:lsdException w:name="toc 4" w:semiHidden="1" w:uiPriority="39" w:unhideWhenUsed="1"/>
-    <w:lsdException w:name="toc 5" w:semiHidden="1" w:uiPriority="39" w:unhideWhenUsed="1"/>
-    <w:lsdException w:name="toc 6" w:semiHidden="1" w:uiPriority="39" w:unhideWhenUsed="1"/>
-    <w:lsdException w:name="toc 7" w:semiHidden="1" w:uiPriority="39" w:unhideWhenUsed="1"/>
-    <w:lsdException w:name="toc 8" w:semiHidden="1" w:uiPriority="39" w:unhideWhenUsed="1"/>
-    <w:lsdException w:name="toc 9" w:semiHidden="1" w:uiPriority="39" w:unhideWhenUsed="1"/>
-    <w:lsdException w:name="Normal Indent" w:semiHidden="1" w:unhideWhenUsed="1"/>
-    <w:lsdException w:name="footnote text" w:semiHidden="1" w:unhideWhenUsed="1"/>
-    <w:lsdException w:name="annotation text" w:semiHidden="1" w:unhideWhenUsed="1"/>
-    <w:lsdException w:name="header" w:semiHidden="1" w:unhideWhenUsed="1"/>
-    <w:lsdException w:name="footer" w:semiHidden="1" w:unhideWhenUsed="1"/>
-    <w:lsdException w:name="index heading" w:semiHidden="1" w:unhideWhenUsed="1"/>
-    <w:lsdException w:name="caption" w:semiHidden="1" w:uiPriority="35" w:unhideWhenUsed="1" w:qFormat="1"/>
-    <w:lsdException w:name="table of figures" w:semiHidden="1" w:unhideWhenUsed="1"/>
-    <w:lsdException w:name="envelope address" w:semiHidden="1" w:unhideWhenUsed="1"/>
-    <w:lsdException w:name="envelope return" w:semiHidden="1" w:unhideWhenUsed="1"/>
-    <w:lsdException w:name="footnote reference" w:semiHidden="1" w:unhideWhenUsed="1"/>
-    <w:lsdException w:name="annotation reference" w:semiHidden="1" w:unhideWhenUsed="1"/>
-    <w:lsdException w:name="line number" w:semiHidden="1" w:unhideWhenUsed="1"/>
-    <w:lsdException w:name="page number" w:semiHidden="1" w:unhideWhenUsed="1"/>
-    <w:lsdException w:name="endnote reference" w:semiHidden="1" w:unhideWhenUsed="1"/>
-    <w:lsdException w:name="endnote text" w:semiHidden="1" w:unhideWhenUsed="1"/>
-    <w:lsdException w:name="table of authorities" w:semiHidden="1" w:unhideWhenUsed="1"/>
-    <w:lsdException w:name="macro" w:semiHidden="1" w:unhideWhenUsed="1"/>
-    <w:lsdException w:name="toa heading" w:semiHidden="1" w:unhideWhenUsed="1"/>
-    <w:lsdException w:name="List" w:semiHidden="1" w:unhideWhenUsed="1"/>
-    <w:lsdException w:name="List Bullet" w:semiHidden="1" w:unhideWhenUsed="1"/>
-    <w:lsdException w:name="List Number" w:semiHidden="1" w:unhideWhenUsed="1"/>
-    <w:lsdException w:name="List 2" w:semiHidden="1" w:unhideWhenUsed="1"/>
-    <w:lsdException w:name="List 3" w:semiHidden="1" w:unhideWhenUsed="1"/>
-    <w:lsdException w:name="List 4" w:semiHidden="1" w:unhideWhenUsed="1"/>
-    <w:lsdException w:name="List 5" w:semiHidden="1" w:unhideWhenUsed="1"/>
-    <w:lsdException w:name="List Bullet 2" w:semiHidden="1" w:unhideWhenUsed="1"/>
-    <w:lsdException w:name="List Bullet 3" w:semiHidden="1" w:unhideWhenUsed="1"/>
-    <w:lsdException w:name="List Bullet 4" w:semiHidden="1" w:unhideWhenUsed="1"/>
-    <w:lsdException w:name="List Bullet 5" w:semiHidden="1" w:unhideWhenUsed="1"/>
-    <w:lsdException w:name="List Number 2" w:semiHidden="1" w:unhideWhenUsed="1"/>
-    <w:lsdException w:name="List Number 3" w:semiHidden="1" w:unhideWhenUsed="1"/>
-    <w:lsdException w:name="List Number 4" w:semiHidden="1" w:unhideWhenUsed="1"/>
-    <w:lsdException w:name="List Number 5" w:semiHidden="1" w:unhideWhenUsed="1"/>
-    <w:lsdException w:name="Title" w:uiPriority="10" w:qFormat="1"/>
-    <w:lsdException w:name="Closing" w:semiHidden="1" w:unhideWhenUsed="1"/>
-    <w:lsdException w:name="Signature" w:semiHidden="1" w:unhideWhenUsed="1"/>
-    <w:lsdException w:name="Default Paragraph Font" w:semiHidden="1" w:uiPriority="1" w:unhideWhenUsed="1"/>
-    <w:lsdException w:name="Body Text" w:semiHidden="1" w:unhideWhenUsed="1"/>
-    <w:lsdException w:name="Body Text Indent" w:semiHidden="1" w:unhideWhenUsed="1"/>
-    <w:lsdException w:name="List Continue" w:semiHidden="1" w:unhideWhenUsed="1"/>
-    <w:lsdException w:name="List Continue 2" w:semiHidden="1" w:unhideWhenUsed="1"/>
-    <w:lsdException w:name="List Continue 3" w:semiHidden="1" w:unhideWhenUsed="1"/>
-    <w:lsdException w:name="List Continue 4" w:semiHidden="1" w:unhideWhenUsed="1"/>
-    <w:lsdException w:name="List Continue 5" w:semiHidden="1" w:unhideWhenUsed="1"/>
-    <w:lsdException w:name="Message Header" w:semiHidden="1" w:unhideWhenUsed="1"/>
-    <w:lsdException w:name="Subtitle" w:uiPriority="11" w:qFormat="1"/>
-    <w:lsdException w:name="Salutation" w:semiHidden="1" w:unhideWhenUsed="1"/>
-    <w:lsdException w:name="Date" w:semiHidden="1" w:unhideWhenUsed="1"/>
-    <w:lsdException w:name="Body Text First Indent" w:semiHidden="1" w:unhideWhenUsed="1"/>
-    <w:lsdException w:name="Body Text First Indent 2" w:semiHidden="1" w:unhideWhenUsed="1"/>
-    <w:lsdException w:name="Note Heading" w:semiHidden="1" w:unhideWhenUsed="1"/>
-    <w:lsdException w:name="Body Text 2" w:semiHidden="1" w:unhideWhenUsed="1"/>
-    <w:lsdException w:name="Body Text 3" w:semiHidden="1" w:unhideWhenUsed="1"/>
-    <w:lsdException w:name="Body Text Indent 2" w:semiHidden="1" w:unhideWhenUsed="1"/>
-    <w:lsdException w:name="Body Text Indent 3" w:semiHidden="1" w:unhideWhenUsed="1"/>
-    <w:lsdException w:name="Block Text" w:semiHidden="1" w:unhideWhenUsed="1"/>
-    <w:lsdException w:name="Hyperlink" w:semiHidden="1" w:unhideWhenUsed="1"/>
-    <w:lsdException w:name="FollowedHyperlink" w:semiHidden="1" w:unhideWhenUsed="1"/>
-    <w:lsdException w:name="Strong" w:uiPriority="22" w:qFormat="1"/>
-    <w:lsdException w:name="Emphasis" w:uiPriority="20" w:qFormat="1"/>
-    <w:lsdException w:name="Document Map" w:semiHidden="1" w:unhideWhenUsed="1"/>
-    <w:lsdException w:name="Plain Text" w:semiHidden="1" w:unhideWhenUsed="1"/>
-    <w:lsdException w:name="E-mail Signature" w:semiHidden="1" w:unhideWhenUsed="1"/>
-    <w:lsdException w:name="HTML Top of Form" w:semiHidden="1" w:unhideWhenUsed="1"/>
-    <w:lsdException w:name="HTML Bottom of Form" w:semiHidden="1" w:unhideWhenUsed="1"/>
-    <w:lsdException w:name="Normal (Web)" w:semiHidden="1" w:unhideWhenUsed="1"/>
-    <w:lsdException w:name="HTML Acronym" w:semiHidden="1" w:unhideWhenUsed="1"/>
-    <w:lsdException w:name="HTML Address" w:semiHidden="1" w:unhideWhenUsed="1"/>
-    <w:lsdException w:name="HTML Cite" w:semiHidden="1" w:unhideWhenUsed="1"/>
-    <w:lsdException w:name="HTML Code" w:semiHidden="1" w:unhideWhenUsed="1"/>
-    <w:lsdException w:name="HTML Definition" w:semiHidden="1" w:unhideWhenUsed="1"/>
-    <w:lsdException w:name="HTML Keyboard" w:semiHidden="1" w:unhideWhenUsed="1"/>
-    <w:lsdException w:name="HTML Preformatted" w:semiHidden="1" w:unhideWhenUsed="1"/>
-    <w:lsdException w:name="HTML Sample" w:semiHidden="1" w:unhideWhenUsed="1"/>
-    <w:lsdException w:name="HTML Typewriter" w:semiHidden="1" w:unhideWhenUsed="1"/>
-    <w:lsdException w:name="HTML Variable" w:semiHidden="1" w:unhideWhenUsed="1"/>
-    <w:lsdException w:name="Normal Table" w:semiHidden="1" w:unhideWhenUsed="1"/>
-    <w:lsdException w:name="annotation subject" w:semiHidden="1" w:unhideWhenUsed="1"/>
-    <w:lsdException w:name="No List" w:semiHidden="1" w:unhideWhenUsed="1"/>
-    <w:lsdException w:name="Outline List 1" w:semiHidden="1" w:unhideWhenUsed="1"/>
-    <w:lsdException w:name="Outline List 2" w:semiHidden="1" w:unhideWhenUsed="1"/>
-    <w:lsdException w:name="Outline List 3" w:semiHidden="1" w:unhideWhenUsed="1"/>
-    <w:lsdException w:name="Table Simple 1" w:semiHidden="1" w:unhideWhenUsed="1"/>
-    <w:lsdException w:name="Table Simple 2" w:semiHidden="1" w:unhideWhenUsed="1"/>
-    <w:lsdException w:name="Table Simple 3" w:semiHidden="1" w:unhideWhenUsed="1"/>
-    <w:lsdException w:name="Table Classic 1" w:semiHidden="1" w:unhideWhenUsed="1"/>
-    <w:lsdException w:name="Table Classic 2" w:semiHidden="1" w:unhideWhenUsed="1"/>
-    <w:lsdException w:name="Table Classic 3" w:semiHidden="1" w:unhideWhenUsed="1"/>
-    <w:lsdException w:name="Table Classic 4" w:semiHidden="1" w:unhideWhenUsed="1"/>
-    <w:lsdException w:name="Table Colorful 1" w:semiHidden="1" w:unhideWhenUsed="1"/>
-    <w:lsdException w:name="Table Colorful 2" w:semiHidden="1" w:unhideWhenUsed="1"/>
-    <w:lsdException w:name="Table Colorful 3" w:semiHidden="1" w:unhideWhenUsed="1"/>
-    <w:lsdException w:name="Table Columns 1" w:semiHidden="1" w:unhideWhenUsed="1"/>
-    <w:lsdException w:name="Table Columns 2" w:semiHidden="1" w:unhideWhenUsed="1"/>
-    <w:lsdException w:name="Table Columns 3" w:semiHidden="1" w:unhideWhenUsed="1"/>
-    <w:lsdException w:name="Table Columns 4" w:semiHidden="1" w:unhideWhenUsed="1"/>
-    <w:lsdException w:name="Table Columns 5" w:semiHidden="1" w:unhideWhenUsed="1"/>
-    <w:lsdException w:name="Table Grid 1" w:semiHidden="1" w:unhideWhenUsed="1"/>
-    <w:lsdException w:name="Table Grid 2" w:semiHidden="1" w:unhideWhenUsed="1"/>
-    <w:lsdException w:name="Table Grid 3" w:semiHidden="1" w:unhideWhenUsed="1"/>
-    <w:lsdException w:name="Table Grid 4" w:semiHidden="1" w:unhideWhenUsed="1"/>
-    <w:lsdException w:name="Table Grid 5" w:semiHidden="1" w:unhideWhenUsed="1"/>
-    <w:lsdException w:name="Table Grid 6" w:semiHidden="1" w:unhideWhenUsed="1"/>
-    <w:lsdException w:name="Table Grid 7" w:semiHidden="1" w:unhideWhenUsed="1"/>
-    <w:lsdException w:name="Table Grid 8" w:semiHidden="1" w:unhideWhenUsed="1"/>
-    <w:lsdException w:name="Table List 1" w:semiHidden="1" w:unhideWhenUsed="1"/>
-    <w:lsdException w:name="Table List 2" w:semiHidden="1" w:unhideWhenUsed="1"/>
-    <w:lsdException w:name="Table List 3" w:semiHidden="1" w:unhideWhenUsed="1"/>
-    <w:lsdException w:name="Table List 4" w:semiHidden="1" w:unhideWhenUsed="1"/>
-    <w:lsdException w:name="Table List 5" w:semiHidden="1" w:unhideWhenUsed="1"/>
-    <w:lsdException w:name="Table List 6" w:semiHidden="1" w:unhideWhenUsed="1"/>
-    <w:lsdException w:name="Table List 7" w:semiHidden="1" w:unhideWhenUsed="1"/>
-    <w:lsdException w:name="Table List 8" w:semiHidden="1" w:unhideWhenUsed="1"/>
-    <w:lsdException w:name="Table 3D effects 1" w:semiHidden="1" w:unhideWhenUsed="1"/>
-    <w:lsdException w:name="Table 3D effects 2" w:semiHidden="1" w:unhideWhenUsed="1"/>
-    <w:lsdException w:name="Table 3D effects 3" w:semiHidden="1" w:unhideWhenUsed="1"/>
-    <w:lsdException w:name="Table Contemporary" w:semiHidden="1" w:unhideWhenUsed="1"/>
-    <w:lsdException w:name="Table Elegant" w:semiHidden="1" w:unhideWhenUsed="1"/>
-    <w:lsdException w:name="Table Professional" w:semiHidden="1" w:unhideWhenUsed="1"/>
-    <w:lsdException w:name="Table Subtle 1" w:semiHidden="1" w:unhideWhenUsed="1"/>
-    <w:lsdException w:name="Table Subtle 2" w:semiHidden="1" w:unhideWhenUsed="1"/>
-    <w:lsdException w:name="Table Web 1" w:semiHidden="1" w:unhideWhenUsed="1"/>
-    <w:lsdException w:name="Table Web 2" w:semiHidden="1" w:unhideWhenUsed="1"/>
-    <w:lsdException w:name="Table Web 3" w:semiHidden="1" w:unhideWhenUsed="1"/>
-    <w:lsdException w:name="Balloon Text" w:semiHidden="1" w:unhideWhenUsed="1"/>
-    <w:lsdException w:name="Table Grid" w:uiPriority="39"/>
-    <w:lsdException w:name="Table Theme" w:semiHidden="1" w:unhideWhenUsed="1"/>
-    <w:lsdException w:name="Placeholder Text" w:semiHidden="1"/>
-    <w:lsdException w:name="No Spacing" w:uiPriority="1" w:qFormat="1"/>
-    <w:lsdException w:name="Light Shading" w:uiPriority="60"/>
-    <w:lsdException w:name="Light List" w:uiPriority="61"/>
-    <w:lsdException w:name="Light Grid" w:uiPriority="62"/>
-    <w:lsdException w:name="Medium Shading 1" w:uiPriority="63"/>
-    <w:lsdException w:name="Medium Shading 2" w:uiPriority="64"/>
-    <w:lsdException w:name="Medium List 1" w:uiPriority="65"/>
-    <w:lsdException w:name="Medium List 2" w:uiPriority="66"/>
-    <w:lsdException w:name="Medium Grid 1" w:uiPriority="67"/>
-    <w:lsdException w:name="Medium Grid 2" w:uiPriority="68"/>
-    <w:lsdException w:name="Medium Grid 3" w:uiPriority="69"/>
-    <w:lsdException w:name="Dark List" w:uiPriority="70"/>
-    <w:lsdException w:name="Colorful Shading" w:uiPriority="71"/>
-    <w:lsdException w:name="Colorful List" w:uiPriority="72"/>
-    <w:lsdException w:name="Colorful Grid" w:uiPriority="73"/>
-    <w:lsdException w:name="Light Shading Accent 1" w:uiPriority="60"/>
-    <w:lsdException w:name="Light List Accent 1" w:uiPriority="61"/>
-    <w:lsdException w:name="Light Grid Accent 1" w:uiPriority="62"/>
-    <w:lsdException w:name="Medium Shading 1 Accent 1" w:uiPriority="63"/>
-    <w:lsdException w:name="Medium Shading 2 Accent 1" w:uiPriority="64"/>
-    <w:lsdException w:name="Medium List 1 Accent 1" w:uiPriority="65"/>
-    <w:lsdException w:name="Revision" w:semiHidden="1"/>
-    <w:lsdException w:name="List Paragraph" w:uiPriority="34" w:qFormat="1"/>
-    <w:lsdException w:name="Quote" w:uiPriority="29" w:qFormat="1"/>
-    <w:lsdException w:name="Intense Quote" w:uiPriority="30" w:qFormat="1"/>
-    <w:lsdException w:name="Medium List 2 Accent 1" w:uiPriority="66"/>
-    <w:lsdException w:name="Medium Grid 1 Accent 1" w:uiPriority="67"/>
-    <w:lsdException w:name="Medium Grid 2 Accent 1" w:uiPriority="68"/>
-    <w:lsdException w:name="Medium Grid 3 Accent 1" w:uiPriority="69"/>
-    <w:lsdException w:name="Dark List Accent 1" w:uiPriority="70"/>
-    <w:lsdException w:name="Colorful Shading Accent 1" w:uiPriority="71"/>
-    <w:lsdException w:name="Colorful List Accent 1" w:uiPriority="72"/>
-    <w:lsdException w:name="Colorful Grid Accent 1" w:uiPriority="73"/>
-    <w:lsdException w:name="Light Shading Accent 2" w:uiPriority="60"/>
-    <w:lsdException w:name="Light List Accent 2" w:uiPriority="61"/>
-    <w:lsdException w:name="Light Grid Accent 2" w:uiPriority="62"/>
-    <w:lsdException w:name="Medium Shading 1 Accent 2" w:uiPriority="63"/>
-    <w:lsdException w:name="Medium Shading 2 Accent 2" w:uiPriority="64"/>
-    <w:lsdException w:name="Medium List 1 Accent 2" w:uiPriority="65"/>
-    <w:lsdException w:name="Medium List 2 Accent 2" w:uiPriority="66"/>
-    <w:lsdException w:name="Medium Grid 1 Accent 2" w:uiPriority="67"/>
-    <w:lsdException w:name="Medium Grid 2 Accent 2" w:uiPriority="68"/>
-    <w:lsdException w:name="Medium Grid 3 Accent 2" w:uiPriority="69"/>
-    <w:lsdException w:name="Dark List Accent 2" w:uiPriority="70"/>
-    <w:lsdException w:name="Colorful Shading Accent 2" w:uiPriority="71"/>
-    <w:lsdException w:name="Colorful List Accent 2" w:uiPriority="72"/>
-    <w:lsdException w:name="Colorful Grid Accent 2" w:uiPriority="73"/>
-    <w:lsdException w:name="Light Shading Accent 3" w:uiPriority="60"/>
-    <w:lsdException w:name="Light List Accent 3" w:uiPriority="61"/>
-    <w:lsdException w:name="Light Grid Accent 3" w:uiPriority="62"/>
-    <w:lsdException w:name="Medium Shading 1 Accent 3" w:uiPriority="63"/>
-    <w:lsdException w:name="Medium Shading 2 Accent 3" w:uiPriority="64"/>
-    <w:lsdException w:name="Medium List 1 Accent 3" w:uiPriority="65"/>
-    <w:lsdException w:name="Medium List 2 Accent 3" w:uiPriority="66"/>
-    <w:lsdException w:name="Medium Grid 1 Accent 3" w:uiPriority="67"/>
-    <w:lsdException w:name="Medium Grid 2 Accent 3" w:uiPriority="68"/>
-    <w:lsdException w:name="Medium Grid 3 Accent 3" w:uiPriority="69"/>
-    <w:lsdException w:name="Dark List Accent 3" w:uiPriority="70"/>
-    <w:lsdException w:name="Colorful Shading Accent 3" w:uiPriority="71"/>
-    <w:lsdException w:name="Colorful List Accent 3" w:uiPriority="72"/>
-    <w:lsdException w:name="Colorful Grid Accent 3" w:uiPriority="73"/>
-    <w:lsdException w:name="Light Shading Accent 4" w:uiPriority="60"/>
-    <w:lsdException w:name="Light List Accent 4" w:uiPriority="61"/>
-    <w:lsdException w:name="Light Grid Accent 4" w:uiPriority="62"/>
-    <w:lsdException w:name="Medium Shading 1 Accent 4" w:uiPriority="63"/>
-    <w:lsdException w:name="Medium Shading 2 Accent 4" w:uiPriority="64"/>
-    <w:lsdException w:name="Medium List 1 Accent 4" w:uiPriority="65"/>
-    <w:lsdException w:name="Medium List 2 Accent 4" w:uiPriority="66"/>
-    <w:lsdException w:name="Medium Grid 1 Accent 4" w:uiPriority="67"/>
-    <w:lsdException w:name="Medium Grid 2 Accent 4" w:uiPriority="68"/>
-    <w:lsdException w:name="Medium Grid 3 Accent 4" w:uiPriority="69"/>
-    <w:lsdException w:name="Dark List Accent 4" w:uiPriority="70"/>
-    <w:lsdException w:name="Colorful Shading Accent 4" w:uiPriority="71"/>
-    <w:lsdException w:name="Colorful List Accent 4" w:uiPriority="72"/>
-    <w:lsdException w:name="Colorful Grid Accent 4" w:uiPriority="73"/>
-    <w:lsdException w:name="Light Shading Accent 5" w:uiPriority="60"/>
-    <w:lsdException w:name="Light List Accent 5" w:uiPriority="61"/>
-    <w:lsdException w:name="Light Grid Accent 5" w:uiPriority="62"/>
-    <w:lsdException w:name="Medium Shading 1 Accent 5" w:uiPriority="63"/>
-    <w:lsdException w:name="Medium Shading 2 Accent 5" w:uiPriority="64"/>
-    <w:lsdException w:name="Medium List 1 Accent 5" w:uiPriority="65"/>
-    <w:lsdException w:name="Medium List 2 Accent 5" w:uiPriority="66"/>
-    <w:lsdException w:name="Medium Grid 1 Accent 5" w:uiPriority="67"/>
-    <w:lsdException w:name="Medium Grid 2 Accent 5" w:uiPriority="68"/>
-    <w:lsdException w:name="Medium Grid 3 Accent 5" w:uiPriority="69"/>
-    <w:lsdException w:name="Dark List Accent 5" w:uiPriority="70"/>
-    <w:lsdException w:name="Colorful Shading Accent 5" w:uiPriority="71"/>
-    <w:lsdException w:name="Colorful List Accent 5" w:uiPriority="72"/>
-    <w:lsdException w:name="Colorful Grid Accent 5" w:uiPriority="73"/>
-    <w:lsdException w:name="Light Shading Accent 6" w:uiPriority="60"/>
-    <w:lsdException w:name="Light List Accent 6" w:uiPriority="61"/>
-    <w:lsdException w:name="Light Grid Accent 6" w:uiPriority="62"/>
-    <w:lsdException w:name="Medium Shading 1 Accent 6" w:uiPriority="63"/>
-    <w:lsdException w:name="Medium Shading 2 Accent 6" w:uiPriority="64"/>
-    <w:lsdException w:name="Medium List 1 Accent 6" w:uiPriority="65"/>
-    <w:lsdException w:name="Medium List 2 Accent 6" w:uiPriority="66"/>
-    <w:lsdException w:name="Medium Grid 1 Accent 6" w:uiPriority="67"/>
-    <w:lsdException w:name="Medium Grid 2 Accent 6" w:uiPriority="68"/>
-    <w:lsdException w:name="Medium Grid 3 Accent 6" w:uiPriority="69"/>
-    <w:lsdException w:name="Dark List Accent 6" w:uiPriority="70"/>
-    <w:lsdException w:name="Colorful Shading Accent 6" w:uiPriority="71"/>
-    <w:lsdException w:name="Colorful List Accent 6" w:uiPriority="72"/>
-    <w:lsdException w:name="Colorful Grid Accent 6" w:uiPriority="73"/>
-    <w:lsdException w:name="Subtle Emphasis" w:uiPriority="19" w:qFormat="1"/>
-    <w:lsdException w:name="Intense Emphasis" w:uiPriority="21" w:qFormat="1"/>
-    <w:lsdException w:name="Subtle Reference" w:uiPriority="31" w:qFormat="1"/>
-    <w:lsdException w:name="Intense Reference" w:uiPriority="32" w:qFormat="1"/>
-    <w:lsdException w:name="Book Title" w:uiPriority="33" w:qFormat="1"/>
-    <w:lsdException w:name="Bibliography" w:semiHidden="1" w:uiPriority="37" w:unhideWhenUsed="1"/>
-    <w:lsdException w:name="TOC Heading" w:semiHidden="1" w:uiPriority="39" w:unhideWhenUsed="1" w:qFormat="1"/>
-    <w:lsdException w:name="Plain Table 1" w:uiPriority="41"/>
-    <w:lsdException w:name="Plain Table 2" w:uiPriority="42"/>
-    <w:lsdException w:name="Plain Table 3" w:uiPriority="43"/>
-    <w:lsdException w:name="Plain Table 4" w:uiPriority="44"/>
-    <w:lsdException w:name="Plain Table 5" w:uiPriority="45"/>
-    <w:lsdException w:name="Grid Table Light" w:uiPriority="40"/>
-    <w:lsdException w:name="Grid Table 1 Light" w:uiPriority="46"/>
-    <w:lsdException w:name="Grid Table 2" w:uiPriority="47"/>
-    <w:lsdException w:name="Grid Table 3" w:uiPriority="48"/>
-    <w:lsdException w:name="Grid Table 4" w:uiPriority="49"/>
-    <w:lsdException w:name="Grid Table 5 Dark" w:uiPriority="50"/>
-    <w:lsdException w:name="Grid Table 6 Colorful" w:uiPriority="51"/>
-    <w:lsdException w:name="Grid Table 7 Colorful" w:uiPriority="52"/>
-    <w:lsdException w:name="Grid Table 1 Light Accent 1" w:uiPriority="46"/>
-    <w:lsdException w:name="Grid Table 2 Accent 1" w:uiPriority="47"/>
-    <w:lsdException w:name="Grid Table 3 Accent 1" w:uiPriority="48"/>
-    <w:lsdException w:name="Grid Table 4 Accent 1" w:uiPriority="49"/>
-    <w:lsdException w:name="Grid Table 5 Dark Accent 1" w:uiPriority="50"/>
-    <w:lsdException w:name="Grid Table 6 Colorful Accent 1" w:uiPriority="51"/>
-    <w:lsdException w:name="Grid Table 7 Colorful Accent 1" w:uiPriority="52"/>
-    <w:lsdException w:name="Grid Table 1 Light Accent 2" w:uiPriority="46"/>
-    <w:lsdException w:name="Grid Table 2 Accent 2" w:uiPriority="47"/>
-    <w:lsdException w:name="Grid Table 3 Accent 2" w:uiPriority="48"/>
-    <w:lsdException w:name="Grid Table 4 Accent 2" w:uiPriority="49"/>
-    <w:lsdException w:name="Grid Table 5 Dark Accent 2" w:uiPriority="50"/>
-    <w:lsdException w:name="Grid Table 6 Colorful Accent 2" w:uiPriority="51"/>
-    <w:lsdException w:name="Grid Table 7 Colorful Accent 2" w:uiPriority="52"/>
-    <w:lsdException w:name="Grid Table 1 Light Accent 3" w:uiPriority="46"/>
-    <w:lsdException w:name="Grid Table 2 Accent 3" w:uiPriority="47"/>
-    <w:lsdException w:name="Grid Table 3 Accent 3" w:uiPriority="48"/>
-    <w:lsdException w:name="Grid Table 4 Accent 3" w:uiPriority="49"/>
-    <w:lsdException w:name="Grid Table 5 Dark Accent 3" w:uiPriority="50"/>
-    <w:lsdException w:name="Grid Table 6 Colorful Accent 3" w:uiPriority="51"/>
-    <w:lsdException w:name="Grid Table 7 Colorful Accent 3" w:uiPriority="52"/>
-    <w:lsdException w:name="Grid Table 1 Light Accent 4" w:uiPriority="46"/>
-    <w:lsdException w:name="Grid Table 2 Accent 4" w:uiPriority="47"/>
-    <w:lsdException w:name="Grid Table 3 Accent 4" w:uiPriority="48"/>
-    <w:lsdException w:name="Grid Table 4 Accent 4" w:uiPriority="49"/>
-    <w:lsdException w:name="Grid Table 5 Dark Accent 4" w:uiPriority="50"/>
-    <w:lsdException w:name="Grid Table 6 Colorful Accent 4" w:uiPriority="51"/>
-    <w:lsdException w:name="Grid Table 7 Colorful Accent 4" w:uiPriority="52"/>
-    <w:lsdException w:name="Grid Table 1 Light Accent 5" w:uiPriority="46"/>
-    <w:lsdException w:name="Grid Table 2 Accent 5" w:uiPriority="47"/>
-    <w:lsdException w:name="Grid Table 3 Accent 5" w:uiPriority="48"/>
-    <w:lsdException w:name="Grid Table 4 Accent 5" w:uiPriority="49"/>
-    <w:lsdException w:name="Grid Table 5 Dark Accent 5" w:uiPriority="50"/>
-    <w:lsdException w:name="Grid Table 6 Colorful Accent 5" w:uiPriority="51"/>
-    <w:lsdException w:name="Grid Table 7 Colorful Accent 5" w:uiPriority="52"/>
-    <w:lsdException w:name="Grid Table 1 Light Accent 6" w:uiPriority="46"/>
-    <w:lsdException w:name="Grid Table 2 Accent 6" w:uiPriority="47"/>
-    <w:lsdException w:name="Grid Table 3 Accent 6" w:uiPriority="48"/>
-    <w:lsdException w:name="Grid Table 4 Accent 6" w:uiPriority="49"/>
-    <w:lsdException w:name="Grid Table 5 Dark Accent 6" w:uiPriority="50"/>
-    <w:lsdException w:name="Grid Table 6 Colorful Accent 6" w:uiPriority="51"/>
-    <w:lsdException w:name="Grid Table 7 Colorful Accent 6" w:uiPriority="52"/>
-    <w:lsdException w:name="List Table 1 Light" w:uiPriority="46"/>
-    <w:lsdException w:name="List Table 2" w:uiPriority="47"/>
-    <w:lsdException w:name="List Table 3" w:uiPriority="48"/>
-    <w:lsdException w:name="List Table 4" w:uiPriority="49"/>
-    <w:lsdException w:name="List Table 5 Dark" w:uiPriority="50"/>
-    <w:lsdException w:name="List Table 6 Colorful" w:uiPriority="51"/>
-    <w:lsdException w:name="List Table 7 Colorful" w:uiPriority="52"/>
-    <w:lsdException w:name="List Table 1 Light Accent 1" w:uiPriority="46"/>
-    <w:lsdException w:name="List Table 2 Accent 1" w:uiPriority="47"/>
-    <w:lsdException w:name="List Table 3 Accent 1" w:uiPriority="48"/>
-    <w:lsdException w:name="List Table 4 Accent 1" w:uiPriority="49"/>
-    <w:lsdException w:name="List Table 5 Dark Accent 1" w:uiPriority="50"/>
-    <w:lsdException w:name="List Table 6 Colorful Accent 1" w:uiPriority="51"/>
-    <w:lsdException w:name="List Table 7 Colorful Accent 1" w:uiPriority="52"/>
-    <w:lsdException w:name="List Table 1 Light Accent 2" w:uiPriority="46"/>
-    <w:lsdException w:name="List Table 2 Accent 2" w:uiPriority="47"/>
-    <w:lsdException w:name="List Table 3 Accent 2" w:uiPriority="48"/>
-    <w:lsdException w:name="List Table 4 Accent 2" w:uiPriority="49"/>
-    <w:lsdException w:name="List Table 5 Dark Accent 2" w:uiPriority="50"/>
-    <w:lsdException w:name="List Table 6 Colorful Accent 2" w:uiPriority="51"/>
-    <w:lsdException w:name="List Table 7 Colorful Accent 2" w:uiPriority="52"/>
-    <w:lsdException w:name="List Table 1 Light Accent 3" w:uiPriority="46"/>
-    <w:lsdException w:name="List Table 2 Accent 3" w:uiPriority="47"/>
-    <w:lsdException w:name="List Table 3 Accent 3" w:uiPriority="48"/>
-    <w:lsdException w:name="List Table 4 Accent 3" w:uiPriority="49"/>
-    <w:lsdException w:name="List Table 5 Dark Accent 3" w:uiPriority="50"/>
-    <w:lsdException w:name="List Table 6 Colorful Accent 3" w:uiPriority="51"/>
-    <w:lsdException w:name="List Table 7 Colorful Accent 3" w:uiPriority="52"/>
-    <w:lsdException w:name="List Table 1 Light Accent 4" w:uiPriority="46"/>
-    <w:lsdException w:name="List Table 2 Accent 4" w:uiPriority="47"/>
-    <w:lsdException w:name="List Table 3 Accent 4" w:uiPriority="48"/>
-    <w:lsdException w:name="List Table 4 Accent 4" w:uiPriority="49"/>
-    <w:lsdException w:name="List Table 5 Dark Accent 4" w:uiPriority="50"/>
-    <w:lsdException w:name="List Table 6 Colorful Accent 4" w:uiPriority="51"/>
-    <w:lsdException w:name="List Table 7 Colorful Accent 4" w:uiPriority="52"/>
-    <w:lsdException w:name="List Table 1 Light Accent 5" w:uiPriority="46"/>
-    <w:lsdException w:name="List Table 2 Accent 5" w:uiPriority="47"/>
-    <w:lsdException w:name="List Table 3 Accent 5" w:uiPriority="48"/>
-    <w:lsdException w:name="List Table 4 Accent 5" w:uiPriority="49"/>
-    <w:lsdException w:name="List Table 5 Dark Accent 5" w:uiPriority="50"/>
-    <w:lsdException w:name="List Table 6 Colorful Accent 5" w:uiPriority="51"/>
-    <w:lsdException w:name="List Table 7 Colorful Accent 5" w:uiPriority="52"/>
-    <w:lsdException w:name="List Table 1 Light Accent 6" w:uiPriority="46"/>
-    <w:lsdException w:name="List Table 2 Accent 6" w:uiPriority="47"/>
-    <w:lsdException w:name="List Table 3 Accent 6" w:uiPriority="48"/>
-    <w:lsdException w:name="List Table 4 Accent 6" w:uiPriority="49"/>
-    <w:lsdException w:name="List Table 5 Dark Accent 6" w:uiPriority="50"/>
-    <w:lsdException w:name="List Table 6 Colorful Accent 6" w:uiPriority="51"/>
-    <w:lsdException w:name="List Table 7 Colorful Accent 6" w:uiPriority="52"/>
-  </w:latentStyles>
-  <w:style w:type="paragraph" w:default="1" w:styleId="Normal">
-    <w:name w:val="Normal"/>
-    <w:qFormat/>
-  </w:style>
-  <w:style w:type="character" w:default="1" w:styleId="Fuentedeprrafopredeter">
-    <w:name w:val="Default Paragraph Font"/>
-    <w:uiPriority w:val="1"/>
-    <w:semiHidden/>
-    <w:unhideWhenUsed/>
-  </w:style>
-  <w:style w:type="table" w:default="1" w:styleId="Tablanormal">
-    <w:name w:val="Normal Table"/>
-    <w:uiPriority w:val="99"/>
-    <w:semiHidden/>
-    <w:unhideWhenUsed/>
-    <w:tblPr>
-      <w:tblInd w:w="0" w:type="dxa"/>
-      <w:tblCellMar>
-        <w:top w:w="0" w:type="dxa"/>
-        <w:left w:w="108" w:type="dxa"/>
-        <w:bottom w:w="0" w:type="dxa"/>
-        <w:right w:w="108" w:type="dxa"/>
-      </w:tblCellMar>
-    </w:tblPr>
-  </w:style>
-  <w:style w:type="numbering" w:default="1" w:styleId="Sinlista">
-    <w:name w:val="No List"/>
-    <w:uiPriority w:val="99"/>
-    <w:semiHidden/>
-    <w:unhideWhenUsed/>
-  </w:style>
-</w:styles>
-</file>
-
-<file path=word/glossary/webSettings.xml><?xml version="1.0" encoding="utf-8"?>
-<w:webSettings xmlns:mc="http://schemas.openxmlformats.org/markup-compatibility/2006" xmlns:r="http://schemas.openxmlformats.org/officeDocument/2006/relationships" xmlns:w="http://schemas.openxmlformats.org/wordprocessingml/2006/main" xmlns:w14="http://schemas.microsoft.com/office/word/2010/wordml" xmlns:w15="http://schemas.microsoft.com/office/word/2012/wordml" xmlns:w16se="http://schemas.microsoft.com/office/word/2015/wordml/symex" mc:Ignorable="w14 w15 w16se"/>
 </file>
 
 <file path=word/theme/theme1.xml><?xml version="1.0" encoding="utf-8"?>
@@ -9929,15 +9024,6 @@
 </file>
 
 <file path=customXml/item1.xml><?xml version="1.0" encoding="utf-8"?>
-<?mso-contentType ?>
-<FormTemplates xmlns="http://schemas.microsoft.com/sharepoint/v3/contenttype/forms">
-  <Display>DocumentLibraryForm</Display>
-  <Edit>DocumentLibraryForm</Edit>
-  <New>DocumentLibraryForm</New>
-</FormTemplates>
-</file>
-
-<file path=customXml/item2.xml><?xml version="1.0" encoding="utf-8"?>
 <ct:contentTypeSchema xmlns:ct="http://schemas.microsoft.com/office/2006/metadata/contentType" xmlns:ma="http://schemas.microsoft.com/office/2006/metadata/properties/metaAttributes" ct:_="" ma:_="" ma:contentTypeName="Documento" ma:contentTypeID="0x010100E96778489EE7714D8BD12CC105EB918B" ma:contentTypeVersion="2" ma:contentTypeDescription="Crear nuevo documento." ma:contentTypeScope="" ma:versionID="416c5c7ae9b5d54d83875cd3c65194e3">
   <xsd:schema xmlns:xsd="http://www.w3.org/2001/XMLSchema" xmlns:xs="http://www.w3.org/2001/XMLSchema" xmlns:p="http://schemas.microsoft.com/office/2006/metadata/properties" xmlns:ns2="126e8a1c-9ea9-435a-ac89-d06c80d62e30" targetNamespace="http://schemas.microsoft.com/office/2006/metadata/properties" ma:root="true" ma:fieldsID="70a237c842677bd850644f8595079f5e" ns2:_="">
     <xsd:import namespace="126e8a1c-9ea9-435a-ac89-d06c80d62e30"/>
@@ -10069,25 +9155,26 @@
 </ct:contentTypeSchema>
 </file>
 
+<file path=customXml/item2.xml><?xml version="1.0" encoding="utf-8"?>
+<?mso-contentType ?>
+<FormTemplates xmlns="http://schemas.microsoft.com/sharepoint/v3/contenttype/forms">
+  <Display>DocumentLibraryForm</Display>
+  <Edit>DocumentLibraryForm</Edit>
+  <New>DocumentLibraryForm</New>
+</FormTemplates>
+</file>
+
 <file path=customXml/item3.xml><?xml version="1.0" encoding="utf-8"?>
+<b:Sources xmlns:b="http://schemas.openxmlformats.org/officeDocument/2006/bibliography" xmlns="http://schemas.openxmlformats.org/officeDocument/2006/bibliography" SelectedStyle="\APASixthEditionOfficeOnline.xsl" StyleName="APA" Version="6"/>
+</file>
+
+<file path=customXml/item4.xml><?xml version="1.0" encoding="utf-8"?>
 <p:properties xmlns:p="http://schemas.microsoft.com/office/2006/metadata/properties" xmlns:xsi="http://www.w3.org/2001/XMLSchema-instance" xmlns:pc="http://schemas.microsoft.com/office/infopath/2007/PartnerControls">
   <documentManagement/>
 </p:properties>
 </file>
 
-<file path=customXml/item4.xml><?xml version="1.0" encoding="utf-8"?>
-<b:Sources xmlns:b="http://schemas.openxmlformats.org/officeDocument/2006/bibliography" xmlns="http://schemas.openxmlformats.org/officeDocument/2006/bibliography" SelectedStyle="\APASixthEditionOfficeOnline.xsl" StyleName="APA" Version="6"/>
-</file>
-
 <file path=customXml/itemProps1.xml><?xml version="1.0" encoding="utf-8"?>
-<ds:datastoreItem xmlns:ds="http://schemas.openxmlformats.org/officeDocument/2006/customXml" ds:itemID="{DABAA964-10BA-4DBC-ABF2-CDEAC0FAF7AA}">
-  <ds:schemaRefs>
-    <ds:schemaRef ds:uri="http://schemas.microsoft.com/sharepoint/v3/contenttype/forms"/>
-  </ds:schemaRefs>
-</ds:datastoreItem>
-</file>
-
-<file path=customXml/itemProps2.xml><?xml version="1.0" encoding="utf-8"?>
 <ds:datastoreItem xmlns:ds="http://schemas.openxmlformats.org/officeDocument/2006/customXml" ds:itemID="{90673534-9590-47F8-B0D6-46AB217CB3AD}">
   <ds:schemaRefs>
     <ds:schemaRef ds:uri="http://schemas.microsoft.com/office/2006/metadata/contentType"/>
@@ -10105,26 +9192,27 @@
 </ds:datastoreItem>
 </file>
 
+<file path=customXml/itemProps2.xml><?xml version="1.0" encoding="utf-8"?>
+<ds:datastoreItem xmlns:ds="http://schemas.openxmlformats.org/officeDocument/2006/customXml" ds:itemID="{DABAA964-10BA-4DBC-ABF2-CDEAC0FAF7AA}">
+  <ds:schemaRefs>
+    <ds:schemaRef ds:uri="http://schemas.microsoft.com/sharepoint/v3/contenttype/forms"/>
+  </ds:schemaRefs>
+</ds:datastoreItem>
+</file>
+
 <file path=customXml/itemProps3.xml><?xml version="1.0" encoding="utf-8"?>
-<ds:datastoreItem xmlns:ds="http://schemas.openxmlformats.org/officeDocument/2006/customXml" ds:itemID="{5F1783E3-BA1C-4CA3-8E32-C9B378BBED03}">
+<ds:datastoreItem xmlns:ds="http://schemas.openxmlformats.org/officeDocument/2006/customXml" ds:itemID="{38798A93-35BB-4E36-97F5-7254B21EAFCC}">
   <ds:schemaRefs>
-    <ds:schemaRef ds:uri="http://purl.org/dc/terms/"/>
-    <ds:schemaRef ds:uri="http://purl.org/dc/dcmitype/"/>
-    <ds:schemaRef ds:uri="http://schemas.microsoft.com/office/2006/metadata/properties"/>
-    <ds:schemaRef ds:uri="http://www.w3.org/XML/1998/namespace"/>
-    <ds:schemaRef ds:uri="http://schemas.microsoft.com/office/2006/documentManagement/types"/>
-    <ds:schemaRef ds:uri="126e8a1c-9ea9-435a-ac89-d06c80d62e30"/>
-    <ds:schemaRef ds:uri="http://purl.org/dc/elements/1.1/"/>
-    <ds:schemaRef ds:uri="http://schemas.microsoft.com/office/infopath/2007/PartnerControls"/>
-    <ds:schemaRef ds:uri="http://schemas.openxmlformats.org/package/2006/metadata/core-properties"/>
+    <ds:schemaRef ds:uri="http://schemas.openxmlformats.org/officeDocument/2006/bibliography"/>
   </ds:schemaRefs>
 </ds:datastoreItem>
 </file>
 
 <file path=customXml/itemProps4.xml><?xml version="1.0" encoding="utf-8"?>
-<ds:datastoreItem xmlns:ds="http://schemas.openxmlformats.org/officeDocument/2006/customXml" ds:itemID="{38798A93-35BB-4E36-97F5-7254B21EAFCC}">
+<ds:datastoreItem xmlns:ds="http://schemas.openxmlformats.org/officeDocument/2006/customXml" ds:itemID="{5F1783E3-BA1C-4CA3-8E32-C9B378BBED03}">
   <ds:schemaRefs>
-    <ds:schemaRef ds:uri="http://schemas.openxmlformats.org/officeDocument/2006/bibliography"/>
+    <ds:schemaRef ds:uri="http://schemas.microsoft.com/office/2006/metadata/properties"/>
+    <ds:schemaRef ds:uri="http://schemas.microsoft.com/office/infopath/2007/PartnerControls"/>
   </ds:schemaRefs>
 </ds:datastoreItem>
 </file>
</xml_diff>